<commit_message>
Swysh Den: adopt Steven's layout, remove all highlighting, cut em-dashes
- Based on Steven's edited version (two-line cover tagline, 9/29 date,
  HR add-on removed, retainer set to $2,500)
- Removed all highlighting: stripped every highlight element and flattened
  the 12 form fields to plain text so the gray field shading on the dates
  and entity name is gone; cleared run-level shading
- Reduced em-dashes in the 'What we'll do for you' section (commas /
  parentheses / colons) so the proposal doesn't read as AI-written

Co-Authored-By: Claude Opus 4.8 <noreply@anthropic.com>
Claude-Session: https://claude.ai/code/session_01RfN2m1kgBo1xCWLXRNw2zV
</commit_message>
<xml_diff>
--- a/Onyx_Engagement_Letter_SwyshDen_HOURLY.docx
+++ b/Onyx_Engagement_Letter_SwyshDen_HOURLY.docx
@@ -158,31 +158,22 @@
         </w:rPr>
       </w:pPr>
       <w:r>
-        <w:fldChar w:fldCharType="begin">
-          <w:ffData>
-            <w:name w:val=""/>
-            <w:enabled/>
-            <w:calcOnExit w:val="0"/>
-            <w:textInput>
-              <w:default w:val="[Date of letter]"/>
-            </w:textInput>
-          </w:ffData>
-        </w:fldChar>
-      </w:r>
-      <w:r>
-        <w:instrText xml:space="preserve"> FORMTEXT </w:instrText>
-      </w:r>
-      <w:r>
-        <w:fldChar w:fldCharType="separate"/>
-      </w:r>
-      <w:r>
         <w:rPr>
           <w:noProof/>
         </w:rPr>
-        <w:t>September 25, 2026</w:t>
-      </w:r>
-      <w:r>
-        <w:fldChar w:fldCharType="end"/>
+        <w:t>September 2</w:t>
+      </w:r>
+      <w:r>
+        <w:rPr>
+          <w:noProof/>
+        </w:rPr>
+        <w:t>9</w:t>
+      </w:r>
+      <w:r>
+        <w:rPr>
+          <w:noProof/>
+        </w:rPr>
+        <w:t>, 2026</w:t>
       </w:r>
     </w:p>
     <w:p>
@@ -193,11 +184,11 @@
         </w:rPr>
       </w:pPr>
       <w:r>
-        <w:t xml:space="preserve">Engagement Proposal &amp; Agreement</w:t>
+        <w:t>Engagement Proposal &amp; Agreement</w:t>
       </w:r>
       <w:r>
         <w:br/>
-        <w:t xml:space="preserve">Prepared exclusively for</w:t>
+        <w:t>Prepared exclusively for</w:t>
       </w:r>
     </w:p>
     <w:p>
@@ -205,72 +196,60 @@
         <w:pStyle w:val="CLAProTitle"/>
         <w:rPr>
           <w:color w:val="660003"/>
-        </w:rPr>
-      </w:pPr>
+          <w:sz w:val="48"/>
+          <w:szCs w:val="48"/>
+        </w:rPr>
+      </w:pPr>
+      <w:bookmarkStart w:id="0" w:name="Text1"/>
       <w:r>
         <w:rPr>
           <w:color w:val="auto"/>
-        </w:rPr>
-        <w:fldChar w:fldCharType="begin">
-          <w:ffData>
-            <w:name w:val="Text1"/>
-            <w:enabled/>
-            <w:calcOnExit w:val="0"/>
-            <w:textInput>
-              <w:default w:val="[Client Name]"/>
-            </w:textInput>
-          </w:ffData>
-        </w:fldChar>
-      </w:r>
-      <w:bookmarkStart w:id="0" w:name="Text1"/>
-      <w:r>
-        <w:rPr>
-          <w:color w:val="auto"/>
-        </w:rPr>
-        <w:instrText xml:space="preserve"> FORMTEXT </w:instrText>
-      </w:r>
-      <w:r>
-        <w:rPr>
-          <w:color w:val="auto"/>
-        </w:rPr>
-      </w:r>
-      <w:r>
-        <w:rPr>
-          <w:color w:val="auto"/>
-        </w:rPr>
-        <w:fldChar w:fldCharType="separate"/>
+          <w:sz w:val="48"/>
+          <w:szCs w:val="48"/>
+        </w:rPr>
       </w:r>
       <w:r>
         <w:rPr>
           <w:noProof/>
           <w:color w:val="auto"/>
+          <w:sz w:val="48"/>
+          <w:szCs w:val="48"/>
         </w:rPr>
         <w:t>Swysh Den Basketball Inc.</w:t>
       </w:r>
-      <w:r>
-        <w:rPr>
-          <w:color w:val="auto"/>
-        </w:rPr>
-        <w:fldChar w:fldCharType="end"/>
-      </w:r>
       <w:bookmarkEnd w:id="0"/>
     </w:p>
     <w:p>
       <w:pPr>
         <w:pStyle w:val="CLAProNormalNoSpaceAfter"/>
-        <w:ind w:left="4140" w:hanging="4590"/>
-      </w:pPr>
-      <w:r>
+        <w:ind w:left="2880" w:firstLine="720"/>
         <w:rPr>
           <w:i/>
         </w:rPr>
-        <w:t xml:space="preserve">The accounting department your business deserves — without the cost and overhead of building one in-house.</w:t>
+      </w:pPr>
+      <w:r>
+        <w:rPr>
+          <w:i/>
+        </w:rPr>
+        <w:t xml:space="preserve">The accounting department your business deserves </w:t>
       </w:r>
     </w:p>
     <w:p>
       <w:pPr>
         <w:pStyle w:val="CLAProNormalNoSpaceAfter"/>
-        <w:ind w:left="4140" w:hanging="4590"/>
+        <w:ind w:left="3420" w:firstLine="720"/>
+      </w:pPr>
+      <w:r>
+        <w:rPr>
+          <w:i/>
+        </w:rPr>
+        <w:t>— without the cost and overhead of building one in-house.</w:t>
+      </w:r>
+    </w:p>
+    <w:p>
+      <w:pPr>
+        <w:pStyle w:val="CLAProNormalNoSpaceAfter"/>
+        <w:ind w:left="4140" w:hanging="720"/>
       </w:pPr>
       <w:r>
         <w:t>·   Books cleanup &amp; catch-up</w:t>
@@ -279,7 +258,7 @@
     <w:p>
       <w:pPr>
         <w:pStyle w:val="CLAProNormalNoSpaceAfter"/>
-        <w:ind w:left="4140" w:hanging="4590"/>
+        <w:ind w:left="4140" w:hanging="720"/>
       </w:pPr>
       <w:r>
         <w:t>·   Monthly close &amp; reporting</w:t>
@@ -288,7 +267,7 @@
     <w:p>
       <w:pPr>
         <w:pStyle w:val="CLAProNormalNoSpaceAfter"/>
-        <w:ind w:left="4140" w:hanging="4590"/>
+        <w:ind w:left="4140" w:hanging="720"/>
       </w:pPr>
       <w:r>
         <w:t>·   SBA / lender-ready financials</w:t>
@@ -297,7 +276,7 @@
     <w:p>
       <w:pPr>
         <w:pStyle w:val="CLAProNormalNoSpaceAfter"/>
-        <w:ind w:left="4140" w:hanging="4590"/>
+        <w:ind w:left="4140" w:hanging="720"/>
       </w:pPr>
       <w:r>
         <w:t>·   Fractional CFO for growth</w:t>
@@ -381,6 +360,9 @@
           <w:headerReference w:type="default" r:id="rId9"/>
           <w:footerReference w:type="default" r:id="rId10"/>
           <w:headerReference w:type="first" r:id="rId11"/>
+          <w:footerReference w:type="first" r:id="rId19"/>
+          <w:headerReference w:type="even" r:id="rId20"/>
+          <w:footerReference w:type="even" r:id="rId21"/>
           <w:pgSz w:w="12240" w:h="15840"/>
           <w:pgMar w:top="7488" w:right="1440" w:bottom="1440" w:left="1440" w:header="720" w:footer="720" w:gutter="0"/>
           <w:cols w:space="720"/>
@@ -417,31 +399,22 @@
         <w:pStyle w:val="CLALTRNormal"/>
       </w:pPr>
       <w:r>
-        <w:fldChar w:fldCharType="begin">
-          <w:ffData>
-            <w:name w:val="Text25"/>
-            <w:enabled/>
-            <w:calcOnExit w:val="0"/>
-            <w:textInput>
-              <w:default w:val="[Date]"/>
-            </w:textInput>
-          </w:ffData>
-        </w:fldChar>
-      </w:r>
-      <w:r>
-        <w:instrText xml:space="preserve"> FORMTEXT </w:instrText>
-      </w:r>
-      <w:r>
-        <w:fldChar w:fldCharType="separate"/>
-      </w:r>
-      <w:r>
         <w:rPr>
           <w:noProof/>
         </w:rPr>
-        <w:t>September 25, 2026</w:t>
-      </w:r>
-      <w:r>
-        <w:fldChar w:fldCharType="end"/>
+        <w:t>September 2</w:t>
+      </w:r>
+      <w:r>
+        <w:rPr>
+          <w:noProof/>
+        </w:rPr>
+        <w:t>9</w:t>
+      </w:r>
+      <w:r>
+        <w:rPr>
+          <w:noProof/>
+        </w:rPr>
+        <w:t>, 2026</w:t>
       </w:r>
     </w:p>
     <w:p>
@@ -449,271 +422,164 @@
         <w:pStyle w:val="CLALTRAddressorSignature"/>
       </w:pPr>
       <w:r>
-        <w:fldChar w:fldCharType="begin">
-          <w:ffData>
-            <w:name w:val="Text46"/>
-            <w:enabled/>
-            <w:calcOnExit w:val="0"/>
-            <w:textInput>
-              <w:default w:val="[Client Name]"/>
-            </w:textInput>
-          </w:ffData>
-        </w:fldChar>
-      </w:r>
-      <w:r>
-        <w:instrText xml:space="preserve"> FORMTEXT </w:instrText>
-      </w:r>
-      <w:r>
-        <w:fldChar w:fldCharType="separate"/>
-      </w:r>
-      <w:r>
         <w:rPr>
           <w:noProof/>
         </w:rPr>
         <w:t>Swysh Den Basketball Inc.</w:t>
       </w:r>
-      <w:r>
-        <w:fldChar w:fldCharType="end"/>
-      </w:r>
+    </w:p>
+    <w:p>
+      <w:pPr>
+        <w:pStyle w:val="CLALTRAddressorSignature"/>
+      </w:pPr>
+      <w:r>
+        <w:t>Attn: Steve, President</w:t>
+      </w:r>
+    </w:p>
+    <w:p>
+      <w:pPr>
+        <w:pStyle w:val="CLALTRAddressorSignature"/>
+      </w:pPr>
+      <w:r>
+        <w:t>8212 E Evans Rd</w:t>
+      </w:r>
+      <w:bookmarkStart w:id="1" w:name="Text11"/>
+      <w:bookmarkEnd w:id="1"/>
+    </w:p>
+    <w:p>
+      <w:pPr>
+        <w:pStyle w:val="CLALTRAddressorSignature"/>
+      </w:pPr>
+      <w:r>
+        <w:t>Scottsdale, AZ 85260</w:t>
+      </w:r>
+      <w:bookmarkStart w:id="2" w:name="Text12"/>
       <w:bookmarkEnd w:id="2"/>
     </w:p>
     <w:p>
       <w:pPr>
         <w:pStyle w:val="CLALTRAddressorSignature"/>
       </w:pPr>
-      <w:r>
-        <w:t>Attn: Steve, President</w:t>
-      </w:r>
-      <w:bookmarkEnd w:id="2"/>
-    </w:p>
-    <w:p>
-      <w:pPr>
-        <w:pStyle w:val="CLALTRAddressorSignature"/>
-      </w:pPr>
-      <w:r>
-        <w:t>8212 E Evans Rd</w:t>
-      </w:r>
-      <w:bookmarkStart w:id="3" w:name="Text11"/>
+    </w:p>
+    <w:p>
+      <w:pPr>
+        <w:pStyle w:val="CLALTRNormal"/>
+      </w:pPr>
+      <w:r>
+        <w:t xml:space="preserve">Dear </w:t>
+      </w:r>
+      <w:bookmarkStart w:id="3" w:name="Text22"/>
+      <w:r>
+        <w:rPr>
+          <w:noProof/>
+        </w:rPr>
+        <w:t>Steve</w:t>
+      </w:r>
       <w:bookmarkEnd w:id="3"/>
-    </w:p>
-    <w:p>
-      <w:pPr>
-        <w:pStyle w:val="CLALTRAddressorSignature"/>
-      </w:pPr>
-      <w:r>
-        <w:t>Scottsdale, AZ 85260</w:t>
-      </w:r>
-      <w:bookmarkStart w:id="4" w:name="Text12"/>
+      <w:r>
+        <w:t>:</w:t>
+      </w:r>
+    </w:p>
+    <w:p>
+      <w:pPr>
+        <w:pStyle w:val="CLALTRNormal"/>
+        <w:jc w:val="both"/>
+      </w:pPr>
+      <w:r>
+        <w:t>We appreciate your decision to retain Onyx Accounting Group, LLC (“ONYX”</w:t>
+      </w:r>
+      <w:r>
+        <w:t xml:space="preserve">, “we”, </w:t>
+      </w:r>
+      <w:r>
+        <w:t>and/or “us” – as the context requires</w:t>
+      </w:r>
+      <w:r>
+        <w:t xml:space="preserve">). </w:t>
+      </w:r>
+      <w:r>
+        <w:t xml:space="preserve">This letter </w:t>
+      </w:r>
+      <w:r>
+        <w:t xml:space="preserve">states </w:t>
+      </w:r>
+      <w:r>
+        <w:t xml:space="preserve">the terms and objectives of </w:t>
+      </w:r>
+      <w:r>
+        <w:t>ONYX’s</w:t>
+      </w:r>
+      <w:r>
+        <w:t xml:space="preserve"> </w:t>
+      </w:r>
+      <w:r>
+        <w:t xml:space="preserve">engagement and the nature and limitations of the services </w:t>
+      </w:r>
+      <w:r>
+        <w:t>Onyx</w:t>
+      </w:r>
+      <w:r>
+        <w:t xml:space="preserve"> will provide for </w:t>
+      </w:r>
+      <w:r>
+        <w:rPr>
+          <w:noProof/>
+        </w:rPr>
+        <w:t>Swysh Den Basketball Inc.</w:t>
+      </w:r>
+      <w:r>
+        <w:t xml:space="preserve"> (“</w:t>
+      </w:r>
+      <w:r>
+        <w:t>the Client</w:t>
+      </w:r>
+      <w:r>
+        <w:t>”</w:t>
+      </w:r>
+      <w:r>
+        <w:t xml:space="preserve">, “you”, and/or “your” – as </w:t>
+      </w:r>
+      <w:r>
+        <w:t>the context requires</w:t>
+      </w:r>
+      <w:r>
+        <w:t xml:space="preserve">) </w:t>
+      </w:r>
+      <w:r>
+        <w:t xml:space="preserve">starting in </w:t>
+      </w:r>
+      <w:r>
+        <w:rPr>
+          <w:noProof/>
+        </w:rPr>
+        <w:t>2025 (the Company’s first year of operations)</w:t>
+      </w:r>
+      <w:r>
+        <w:t xml:space="preserve"> </w:t>
+      </w:r>
+      <w:r>
+        <w:t>for the</w:t>
+      </w:r>
+      <w:r>
+        <w:t xml:space="preserve"> fiscal year</w:t>
+      </w:r>
+      <w:r>
+        <w:t xml:space="preserve"> end</w:t>
+      </w:r>
+      <w:r>
+        <w:t>ing</w:t>
+      </w:r>
+      <w:r>
+        <w:t xml:space="preserve"> </w:t>
+      </w:r>
+      <w:bookmarkStart w:id="4" w:name="Text47"/>
+      <w:r>
+        <w:rPr>
+          <w:noProof/>
+        </w:rPr>
+        <w:t>June 30, 2026</w:t>
+      </w:r>
       <w:bookmarkEnd w:id="4"/>
-    </w:p>
-    <w:p>
-      <w:pPr>
-        <w:pStyle w:val="CLALTRAddressorSignature"/>
-      </w:pPr>
-    </w:p>
-    <w:p>
-      <w:pPr>
-        <w:pStyle w:val="CLALTRNormal"/>
-      </w:pPr>
-      <w:r>
-        <w:t xml:space="preserve">Dear </w:t>
-      </w:r>
-      <w:r>
-        <w:fldChar w:fldCharType="begin">
-          <w:ffData>
-            <w:name w:val="Text22"/>
-            <w:enabled/>
-            <w:calcOnExit w:val="0"/>
-            <w:textInput>
-              <w:default w:val="[Salutation]"/>
-            </w:textInput>
-          </w:ffData>
-        </w:fldChar>
-      </w:r>
-      <w:bookmarkStart w:id="5" w:name="Text22"/>
-      <w:r>
-        <w:instrText xml:space="preserve"> FORMTEXT </w:instrText>
-      </w:r>
-      <w:r>
-        <w:fldChar w:fldCharType="separate"/>
-      </w:r>
-      <w:r>
-        <w:rPr>
-          <w:noProof/>
-        </w:rPr>
-        <w:t>Steve</w:t>
-      </w:r>
-      <w:r>
-        <w:fldChar w:fldCharType="end"/>
-      </w:r>
-      <w:bookmarkEnd w:id="5"/>
-      <w:r>
-        <w:t>:</w:t>
-      </w:r>
-    </w:p>
-    <w:p>
-      <w:pPr>
-        <w:pStyle w:val="CLALTRNormal"/>
-        <w:jc w:val="both"/>
-      </w:pPr>
-      <w:r>
-        <w:t>We appreciate your decision to retain Onyx Accounting Group, LLC (“ONYX”</w:t>
-      </w:r>
-      <w:r>
-        <w:t xml:space="preserve">, “we”, </w:t>
-      </w:r>
-      <w:r>
-        <w:t>and/or “us” – as the context requires</w:t>
-      </w:r>
-      <w:r>
-        <w:t xml:space="preserve">). </w:t>
-      </w:r>
-      <w:r>
-        <w:t xml:space="preserve">This letter </w:t>
-      </w:r>
-      <w:r>
-        <w:t xml:space="preserve">states </w:t>
-      </w:r>
-      <w:r>
-        <w:t xml:space="preserve">the terms and objectives of </w:t>
-      </w:r>
-      <w:r>
-        <w:t>ONYX’s</w:t>
-      </w:r>
-      <w:r>
-        <w:t xml:space="preserve"> </w:t>
-      </w:r>
-      <w:r>
-        <w:t xml:space="preserve">engagement and the nature and limitations of the services </w:t>
-      </w:r>
-      <w:r>
-        <w:t>Onyx</w:t>
-      </w:r>
-      <w:r>
-        <w:t xml:space="preserve"> will provide for </w:t>
-      </w:r>
-      <w:r>
-        <w:fldChar w:fldCharType="begin">
-          <w:ffData>
-            <w:name w:val="Text46"/>
-            <w:enabled/>
-            <w:calcOnExit w:val="0"/>
-            <w:textInput>
-              <w:default w:val="[Client Name]"/>
-            </w:textInput>
-          </w:ffData>
-        </w:fldChar>
-      </w:r>
-      <w:r>
-        <w:instrText xml:space="preserve"> FORMTEXT </w:instrText>
-      </w:r>
-      <w:r>
-        <w:fldChar w:fldCharType="separate"/>
-      </w:r>
-      <w:r>
-        <w:rPr>
-          <w:noProof/>
-        </w:rPr>
-        <w:t>Swysh Den Basketball Inc.</w:t>
-      </w:r>
-      <w:r>
-        <w:fldChar w:fldCharType="end"/>
-      </w:r>
-      <w:r>
-        <w:t xml:space="preserve"> (“</w:t>
-      </w:r>
-      <w:r>
-        <w:t>the Client</w:t>
-      </w:r>
-      <w:r>
-        <w:t>”</w:t>
-      </w:r>
-      <w:r>
-        <w:t xml:space="preserve">, “you”, and/or “your” – as </w:t>
-      </w:r>
-      <w:r>
-        <w:t>the context requires</w:t>
-      </w:r>
-      <w:r>
-        <w:t xml:space="preserve">) </w:t>
-      </w:r>
-      <w:r>
-        <w:t xml:space="preserve">starting in </w:t>
-      </w:r>
-      <w:r>
-        <w:fldChar w:fldCharType="begin">
-          <w:ffData>
-            <w:name w:val="Text27"/>
-            <w:enabled/>
-            <w:calcOnExit w:val="0"/>
-            <w:textInput>
-              <w:default w:val="[period OR year]"/>
-            </w:textInput>
-          </w:ffData>
-        </w:fldChar>
-      </w:r>
-      <w:r>
-        <w:instrText xml:space="preserve"> FORMTEXT </w:instrText>
-      </w:r>
-      <w:r>
-        <w:fldChar w:fldCharType="separate"/>
-      </w:r>
-      <w:r>
-        <w:rPr>
-          <w:noProof/>
-        </w:rPr>
-        <w:t>2025 (the Company’s first year of operations)</w:t>
-      </w:r>
-      <w:r>
-        <w:fldChar w:fldCharType="end"/>
-      </w:r>
-      <w:r>
-        <w:t xml:space="preserve"> </w:t>
-      </w:r>
-      <w:r>
-        <w:t>for the</w:t>
-      </w:r>
-      <w:r>
-        <w:t xml:space="preserve"> fiscal year</w:t>
-      </w:r>
-      <w:r>
-        <w:t xml:space="preserve"> end</w:t>
-      </w:r>
-      <w:r>
-        <w:t>ing</w:t>
-      </w:r>
-      <w:r>
-        <w:t xml:space="preserve"> </w:t>
-      </w:r>
-      <w:bookmarkStart w:id="6" w:name="Text47"/>
-      <w:r>
-        <w:fldChar w:fldCharType="begin">
-          <w:ffData>
-            <w:name w:val="Text47"/>
-            <w:enabled/>
-            <w:calcOnExit w:val="0"/>
-            <w:textInput>
-              <w:default w:val="[Year-end Date]"/>
-            </w:textInput>
-          </w:ffData>
-        </w:fldChar>
-      </w:r>
-      <w:r>
-        <w:instrText xml:space="preserve"> FORMTEXT </w:instrText>
-      </w:r>
-      <w:r>
-        <w:fldChar w:fldCharType="separate"/>
-      </w:r>
-      <w:r>
-        <w:rPr>
-          <w:noProof/>
-        </w:rPr>
-        <w:t>June 30, 2026</w:t>
-      </w:r>
-      <w:r>
-        <w:fldChar w:fldCharType="end"/>
-      </w:r>
-      <w:bookmarkEnd w:id="6"/>
       <w:r>
         <w:t xml:space="preserve"> (the “Initial Period”)</w:t>
       </w:r>
@@ -816,11 +682,11 @@
         <w:rPr>
           <w:caps/>
           <w:color w:val="7F7F7F"/>
+          <w:spacing w:val="60"/>
           <w:sz w:val="18"/>
           <w:szCs w:val="18"/>
-          <w:spacing w:val="60"/>
-        </w:rPr>
-        <w:t xml:space="preserve">Section 1</w:t>
+        </w:rPr>
+        <w:t>Section 1</w:t>
       </w:r>
       <w:r>
         <w:br/>
@@ -830,16 +696,16 @@
           <w:sz w:val="48"/>
           <w:szCs w:val="48"/>
         </w:rPr>
-        <w:t xml:space="preserve">What we’ll do for you</w:t>
-      </w:r>
-    </w:p>
-    <w:p>
-      <w:pPr>
-        <w:pStyle w:val="CLALTRNormal"/>
-        <w:jc w:val="both"/>
-      </w:pPr>
-      <w:r>
-        <w:t>ONYX becomes Swysh Den’s outsourced accounting department — from day-to-day bookkeeping through controller-level oversight to fractional-CFO strategy — without the cost and overhead of building it in-house. The engagement begins with a cleanup and catch-up of the Company’s books from inception, then delivers accurate monthly financials and the reporting the Company’s tax team and SBA lender need, and scales with the business as it grows toward its next facility. The services below are illustrative of what ONYX provides and are not a fixed or exhaustive list; we tailor the mix to the Company’s needs and adjust it as those needs change. This engagement covers Swysh Den Basketball Inc. (the C corporation); any work for related entities would be under a separate agreement.</w:t>
+        <w:t>What we’ll do for you</w:t>
+      </w:r>
+    </w:p>
+    <w:p>
+      <w:pPr>
+        <w:pStyle w:val="CLALTRNormal"/>
+        <w:jc w:val="both"/>
+      </w:pPr>
+      <w:r>
+        <w:t>ONYX becomes Swysh Den’s outsourced accounting department, handling everything from day-to-day bookkeeping through controller-level oversight to fractional-CFO strategy, without the cost and overhead of building it in-house. The engagement begins with a cleanup and catch-up of the Company’s books from inception, then delivers accurate monthly financials and the reporting the Company’s tax team and SBA lender need, and scales with the business as it grows toward its next facility. The services below are illustrative of what ONYX provides and are not a fixed or exhaustive list; we tailor the mix to the Company’s needs and adjust it as those needs change. This engagement covers Swysh Den Basketball Inc. (the C corporation); any work for related entities would be under a separate agreement.</w:t>
       </w:r>
     </w:p>
     <w:p>
@@ -852,7 +718,6 @@
         <w:jc w:val="both"/>
       </w:pPr>
       <w:r>
-        <w:rPr/>
         <w:t>Cleanup and catch-up (initial phase)</w:t>
       </w:r>
     </w:p>
@@ -866,8 +731,7 @@
         <w:jc w:val="both"/>
       </w:pPr>
       <w:r>
-        <w:rPr/>
-        <w:t>Review the Company’s existing accounting and entity structure — including the ROBS / C-corporation setup — to confirm it is recorded and functioning correctly, and identify what needs to be corrected.</w:t>
+        <w:t>Review the Company’s existing accounting and entity structure, including the ROBS / C-corporation setup, to confirm it is recorded and functioning correctly and identify what needs to be corrected.</w:t>
       </w:r>
     </w:p>
     <w:p>
@@ -880,8 +744,7 @@
         <w:jc w:val="both"/>
       </w:pPr>
       <w:r>
-        <w:rPr/>
-        <w:t>Rebuild the books from a clean starting point through the present — roughly thirteen months, crossing fiscal years — reconciling bank, credit-card, and loan accounts along the way.</w:t>
+        <w:t>Rebuild the books from a clean starting point through the present (roughly thirteen months, crossing fiscal years), reconciling bank, credit-card, and loan accounts along the way.</w:t>
       </w:r>
     </w:p>
     <w:p>
@@ -894,7 +757,6 @@
         <w:jc w:val="both"/>
       </w:pPr>
       <w:r>
-        <w:rPr/>
         <w:t>Produce accurate financial statements (balance sheet, profit-and-loss, and AR/AP detail) to support the Company’s extended tax filing and the SBA lender’s reporting requirements.</w:t>
       </w:r>
     </w:p>
@@ -908,8 +770,7 @@
         <w:jc w:val="both"/>
       </w:pPr>
       <w:r>
-        <w:rPr/>
-        <w:t>Provide weekly progress updates during the cleanup — what was accomplished, what remains open, and what we’re waiting on from the Company.</w:t>
+        <w:t>Provide weekly progress updates during the cleanup: what was accomplished, what remains open, and what we’re waiting on from the Company.</w:t>
       </w:r>
     </w:p>
     <w:p>
@@ -919,6 +780,7 @@
       </w:pPr>
       <w:proofErr w:type="gramStart"/>
       <w:r>
+        <w:lastRenderedPageBreak/>
         <w:t>Ongoing</w:t>
       </w:r>
       <w:proofErr w:type="gramEnd"/>
@@ -936,18 +798,16 @@
         <w:jc w:val="both"/>
       </w:pPr>
       <w:r>
-        <w:rPr/>
-        <w:t xml:space="preserve">Day-to-day accounting operations</w:t>
-      </w:r>
-    </w:p>
-    <w:p>
-      <w:pPr>
-        <w:pStyle w:val="CLALTRNormal"/>
-        <w:jc w:val="both"/>
-      </w:pPr>
-      <w:r>
-        <w:rPr/>
-        <w:t xml:space="preserve">Our team handles the recurring transaction work that keeps the books accurate, current, and close-ready:</w:t>
+        <w:t>Day-to-day accounting operations</w:t>
+      </w:r>
+    </w:p>
+    <w:p>
+      <w:pPr>
+        <w:pStyle w:val="CLALTRNormal"/>
+        <w:jc w:val="both"/>
+      </w:pPr>
+      <w:r>
+        <w:t>Our team handles the recurring transaction work that keeps the books accurate, current, and close-ready:</w:t>
       </w:r>
     </w:p>
     <w:p>
@@ -960,8 +820,7 @@
         <w:jc w:val="both"/>
       </w:pPr>
       <w:r>
-        <w:rPr/>
-        <w:t>Manage the accounts payable process — vendor bills recorded and prepared for payment on the Company’s approval.</w:t>
+        <w:t>Manage the accounts payable process, with vendor bills recorded and prepared for payment on the Company’s approval.</w:t>
       </w:r>
     </w:p>
     <w:p>
@@ -974,8 +833,7 @@
         <w:jc w:val="both"/>
       </w:pPr>
       <w:r>
-        <w:rPr/>
-        <w:t>Manage accounts receivable and collections — member and customer billings, applying cash receipts, and following up on outstanding balances.</w:t>
+        <w:t>Manage accounts receivable and collections, including member and customer billings, applying cash receipts, and following up on outstanding balances.</w:t>
       </w:r>
     </w:p>
     <w:p>
@@ -988,7 +846,6 @@
         <w:jc w:val="both"/>
       </w:pPr>
       <w:r>
-        <w:rPr/>
         <w:t>Reconcile bank, credit-card, and loan accounts and post journal entries each month, keeping the books clean and close-ready.</w:t>
       </w:r>
     </w:p>
@@ -1002,8 +859,7 @@
         <w:jc w:val="both"/>
       </w:pPr>
       <w:r>
-        <w:rPr/>
-        <w:t xml:space="preserve">Maintain depreciation schedules</w:t>
+        <w:t>Maintain depreciation schedules</w:t>
       </w:r>
     </w:p>
     <w:p>
@@ -1016,7 +872,6 @@
         <w:jc w:val="both"/>
       </w:pPr>
       <w:r>
-        <w:rPr/>
         <w:t>Close the books at month-end and produce financial statements, reports, and a management dashboard.</w:t>
       </w:r>
     </w:p>
@@ -1030,18 +885,16 @@
         <w:jc w:val="both"/>
       </w:pPr>
       <w:r>
-        <w:rPr/>
-        <w:t xml:space="preserve">Controller-level oversight and reporting</w:t>
-      </w:r>
-    </w:p>
-    <w:p>
-      <w:pPr>
-        <w:pStyle w:val="CLALTRNormal"/>
-        <w:jc w:val="both"/>
-      </w:pPr>
-      <w:r>
-        <w:rPr/>
-        <w:t xml:space="preserve">A second layer of review and reporting that turns clean books into insight, so management always has accurate, timely numbers to act on:</w:t>
+        <w:t>Controller-level oversight and reporting</w:t>
+      </w:r>
+    </w:p>
+    <w:p>
+      <w:pPr>
+        <w:pStyle w:val="CLALTRNormal"/>
+        <w:jc w:val="both"/>
+      </w:pPr>
+      <w:r>
+        <w:t>A second layer of review and reporting that turns clean books into insight, so management always has accurate, timely numbers to act on:</w:t>
       </w:r>
     </w:p>
     <w:p>
@@ -1054,8 +907,7 @@
         <w:jc w:val="both"/>
       </w:pPr>
       <w:r>
-        <w:rPr/>
-        <w:t xml:space="preserve">Review and approve the reconciliations and journal entries our staff prepare, adding a second layer of accuracy and control</w:t>
+        <w:t>Review and approve the reconciliations and journal entries our staff prepare, adding a second layer of accuracy and control</w:t>
       </w:r>
     </w:p>
     <w:p>
@@ -1068,8 +920,7 @@
         <w:jc w:val="both"/>
       </w:pPr>
       <w:r>
-        <w:rPr/>
-        <w:t xml:space="preserve">Reconcile complex accounts and prepare the related journal entries</w:t>
+        <w:t>Reconcile complex accounts and prepare the related journal entries</w:t>
       </w:r>
     </w:p>
     <w:p>
@@ -1082,8 +933,7 @@
         <w:jc w:val="both"/>
       </w:pPr>
       <w:r>
-        <w:rPr/>
-        <w:t xml:space="preserve">Turn the Client’s financial results into clear, actionable analysis and present it to management</w:t>
+        <w:t>Turn the Client’s financial results into clear, actionable analysis and present it to management</w:t>
       </w:r>
     </w:p>
     <w:p>
@@ -1096,8 +946,7 @@
         <w:jc w:val="both"/>
       </w:pPr>
       <w:r>
-        <w:rPr/>
-        <w:t xml:space="preserve">Develop and track the key business metrics that matter most to the Client, and review them with management on a regular basis</w:t>
+        <w:t>Develop and track the key business metrics that matter most to the Client, and review them with management on a regular basis</w:t>
       </w:r>
     </w:p>
     <w:p>
@@ -1110,8 +959,7 @@
         <w:jc w:val="both"/>
       </w:pPr>
       <w:r>
-        <w:rPr/>
-        <w:t xml:space="preserve">Document the Client’s accounting processes and procedures</w:t>
+        <w:t>Document the Client’s accounting processes and procedures</w:t>
       </w:r>
     </w:p>
     <w:p>
@@ -1124,8 +972,7 @@
         <w:jc w:val="both"/>
       </w:pPr>
       <w:r>
-        <w:rPr/>
-        <w:t xml:space="preserve">Continuously refine and strengthen those processes as the business grows</w:t>
+        <w:t>Continuously refine and strengthen those processes as the business grows</w:t>
       </w:r>
     </w:p>
     <w:p>
@@ -1138,8 +985,7 @@
         <w:jc w:val="both"/>
       </w:pPr>
       <w:r>
-        <w:rPr/>
-        <w:t xml:space="preserve">Monitor and manage cash flow so the Client always knows what’s coming in and going out</w:t>
+        <w:t>Monitor and manage cash flow so the Client always knows what’s coming in and going out</w:t>
       </w:r>
     </w:p>
     <w:p>
@@ -1152,8 +998,7 @@
         <w:jc w:val="both"/>
       </w:pPr>
       <w:r>
-        <w:rPr/>
-        <w:t>Prepare the reporting the Company’s SBA lender (Sterns Bank) requires — balance sheet, profit-and-loss, and AR/AP detail — and assist with routine bank communications and information requests.</w:t>
+        <w:t>Prepare the reporting the Company’s SBA lender (Sterns Bank) requires, including the balance sheet, profit-and-loss, and AR/AP detail, and assist with routine bank communications and information requests.</w:t>
       </w:r>
     </w:p>
     <w:p>
@@ -1166,7 +1011,6 @@
         <w:jc w:val="both"/>
       </w:pPr>
       <w:r>
-        <w:rPr/>
         <w:t>Gather and organize everything the Company’s tax team needs for the annual return, including the extended filing now in progress.</w:t>
       </w:r>
     </w:p>
@@ -1180,18 +1024,17 @@
         <w:jc w:val="both"/>
       </w:pPr>
       <w:r>
-        <w:rPr/>
-        <w:t xml:space="preserve">CFO-level strategic support</w:t>
-      </w:r>
-    </w:p>
-    <w:p>
-      <w:pPr>
-        <w:pStyle w:val="CLALTRNormal"/>
-        <w:jc w:val="both"/>
-      </w:pPr>
-      <w:r>
-        <w:rPr/>
-        <w:t xml:space="preserve">On an as-needed or as-requested basis, ONYX serves as the Client’s strategic financial partner, providing the guidance, perspective, and forward-looking planning of a CFO without the full-time cost:</w:t>
+        <w:lastRenderedPageBreak/>
+        <w:t>CFO-level strategic support</w:t>
+      </w:r>
+    </w:p>
+    <w:p>
+      <w:pPr>
+        <w:pStyle w:val="CLALTRNormal"/>
+        <w:jc w:val="both"/>
+      </w:pPr>
+      <w:r>
+        <w:t>On an as-needed or as-requested basis, ONYX serves as the Client’s strategic financial partner, providing the guidance, perspective, and forward-looking planning of a CFO without the full-time cost:</w:t>
       </w:r>
     </w:p>
     <w:p>
@@ -1204,8 +1047,7 @@
         <w:jc w:val="both"/>
       </w:pPr>
       <w:r>
-        <w:rPr/>
-        <w:t xml:space="preserve">Serve as a strategic financial partner to ownership and management, offering guidance and direction across the finance function</w:t>
+        <w:t>Serve as a strategic financial partner to ownership and management, offering guidance and direction across the finance function</w:t>
       </w:r>
     </w:p>
     <w:p>
@@ -1218,8 +1060,7 @@
         <w:jc w:val="both"/>
       </w:pPr>
       <w:r>
-        <w:rPr/>
-        <w:t xml:space="preserve">Advise on financial reporting structure, management reporting, and accounting policy</w:t>
+        <w:t>Advise on financial reporting structure, management reporting, and accounting policy</w:t>
       </w:r>
     </w:p>
     <w:p>
@@ -1232,8 +1073,7 @@
         <w:jc w:val="both"/>
       </w:pPr>
       <w:r>
-        <w:rPr/>
-        <w:t xml:space="preserve">Lead budgeting, forecasting, and long-term financial modeling to support growth and scenario planning</w:t>
+        <w:t>Lead budgeting, forecasting, and long-term financial modeling to support growth and scenario planning</w:t>
       </w:r>
     </w:p>
     <w:p>
@@ -1246,8 +1086,7 @@
         <w:jc w:val="both"/>
       </w:pPr>
       <w:r>
-        <w:rPr/>
-        <w:t>Support financing and growth — preparing lender and investor packages, modeling the land purchase and new-facility build, and assisting with lines of credit and financing negotiations.</w:t>
+        <w:t>Support financing and growth by preparing lender and investor packages, modeling the land purchase and new-facility build, and assisting with lines of credit and financing negotiations.</w:t>
       </w:r>
     </w:p>
     <w:p>
@@ -1260,7 +1099,6 @@
         <w:jc w:val="both"/>
       </w:pPr>
       <w:r>
-        <w:rPr/>
         <w:t>Prepare board and investor packets and provide periodic discussions with ownership as strategic questions arise.</w:t>
       </w:r>
     </w:p>
@@ -1274,7 +1112,7 @@
         <w:jc w:val="both"/>
       </w:pPr>
       <w:r>
-        <w:t xml:space="preserve">The following additional services are available and, when engaged, are described in the attached addendum(s):</w:t>
+        <w:t>The following additional services are available and, when engaged, are described in the attached addendum(s):</w:t>
       </w:r>
     </w:p>
     <w:p>
@@ -1287,8 +1125,7 @@
         <w:jc w:val="both"/>
       </w:pPr>
       <w:r>
-        <w:rPr/>
-        <w:t xml:space="preserve">Payroll preparation</w:t>
+        <w:t>Payroll preparation</w:t>
       </w:r>
     </w:p>
     <w:p>
@@ -1301,60 +1138,43 @@
         <w:jc w:val="both"/>
       </w:pPr>
       <w:r>
+        <w:t>Work Opportunity Tax Credit (WOTC) services</w:t>
+      </w:r>
+    </w:p>
+    <w:p>
+      <w:pPr>
+        <w:pStyle w:val="CLALTRHeading2"/>
+        <w:jc w:val="both"/>
+      </w:pPr>
+      <w:r>
+        <w:t>Adjusting your services as your needs change</w:t>
+      </w:r>
+    </w:p>
+    <w:p>
+      <w:pPr>
+        <w:pStyle w:val="CLALTRNormal"/>
+        <w:jc w:val="both"/>
+      </w:pPr>
+      <w:r>
+        <w:t>Your needs will evolve as your business grows, and this engagement is built to flex with them. Services can be added, reduced, or adjusted at any time by mutual written agreement, including by email, with no formal addendum or new engagement letter required. All other terms of this agreement remain in effect, so adding or removing a service never requires starting over.</w:t>
+      </w:r>
+    </w:p>
+    <w:p>
+      <w:pPr>
+        <w:pStyle w:val="CLALTRHeading1"/>
+        <w:jc w:val="both"/>
         <w:rPr/>
-        <w:t xml:space="preserve">Human resources</w:t>
-      </w:r>
-    </w:p>
-    <w:p>
-      <w:pPr>
-        <w:pStyle w:val="CLALTRNormal"/>
-        <w:numPr>
-          <w:ilvl w:val="0"/>
-          <w:numId w:val="11"/>
-        </w:numPr>
-        <w:jc w:val="both"/>
-      </w:pPr>
-      <w:r>
-        <w:t xml:space="preserve">Work Opportunity Tax Credit (WOTC) services</w:t>
-      </w:r>
-    </w:p>
-    <w:p>
-      <w:pPr>
-        <w:pStyle w:val="CLALTRHeading2"/>
-        <w:jc w:val="both"/>
-      </w:pPr>
-      <w:r>
-        <w:t xml:space="preserve">Adjusting your services as your needs change</w:t>
-      </w:r>
-    </w:p>
-    <w:p>
-      <w:pPr>
-        <w:pStyle w:val="CLALTRNormal"/>
-        <w:jc w:val="both"/>
-      </w:pPr>
-      <w:r>
-        <w:t xml:space="preserve">Your needs will evolve as your business grows, and this engagement is built to flex with them. Services can be added, reduced, or adjusted at any time by mutual written agreement — including by email, with no formal addendum or new engagement letter required. All other terms of this agreement remain in effect, so adding or removing a service never requires starting over.</w:t>
-      </w:r>
-    </w:p>
-    <w:p>
-      <w:pPr>
-        <w:pStyle w:val="CLALTRHeading1"/>
-        <w:jc w:val="both"/>
-        <w:rPr>
-          <w:highlight w:val="yellow"/>
-        </w:rPr>
-      </w:pPr>
-      <w:r>
-        <w:t xml:space="preserve">How we’ll work together</w:t>
-      </w:r>
-    </w:p>
-    <w:p>
-      <w:pPr>
-        <w:pStyle w:val="CLALTRNormal"/>
-        <w:jc w:val="both"/>
-      </w:pPr>
-      <w:r>
-        <w:rPr/>
+      </w:pPr>
+      <w:r>
+        <w:t>How we’ll work together</w:t>
+      </w:r>
+    </w:p>
+    <w:p>
+      <w:pPr>
+        <w:pStyle w:val="CLALTRNormal"/>
+        <w:jc w:val="both"/>
+      </w:pPr>
+      <w:r>
         <w:t>Because ONYX works from the access and records the Company provides — and, at the outset, has view-only access rather than authority to move funds — a few responsibilities stay with the Company. All approvals should be documented in writing, whether electronically or manually:</w:t>
       </w:r>
     </w:p>
@@ -1366,12 +1186,9 @@
           <w:numId w:val="21"/>
         </w:numPr>
         <w:jc w:val="both"/>
-        <w:rPr>
-          <w:highlight w:val="yellow"/>
-        </w:rPr>
-      </w:pPr>
-      <w:r>
         <w:rPr/>
+      </w:pPr>
+      <w:r>
         <w:t>Provide ONYX with access to the accounting system and view access to bank, credit-card, and loan accounts, plus the statements and records needed for the cleanup.</w:t>
       </w:r>
     </w:p>
@@ -1383,12 +1200,9 @@
           <w:numId w:val="21"/>
         </w:numPr>
         <w:jc w:val="both"/>
-        <w:rPr>
-          <w:highlight w:val="yellow"/>
-        </w:rPr>
-      </w:pPr>
-      <w:r>
         <w:rPr/>
+      </w:pPr>
+      <w:r>
         <w:t>Provide timely, accurate information and a primary point of contact, and respond to open-item requests during the cleanup.</w:t>
       </w:r>
     </w:p>
@@ -1400,12 +1214,9 @@
           <w:numId w:val="21"/>
         </w:numPr>
         <w:jc w:val="both"/>
-        <w:rPr>
-          <w:highlight w:val="yellow"/>
-        </w:rPr>
-      </w:pPr>
-      <w:r>
         <w:rPr/>
+      </w:pPr>
+      <w:r>
         <w:t>Retain approval authority over the Company’s own transactions — invoices and payments, new vendors and customers, and payroll — and approve any payments ONYX is later engaged to process.</w:t>
       </w:r>
     </w:p>
@@ -1417,12 +1228,10 @@
           <w:numId w:val="21"/>
         </w:numPr>
         <w:jc w:val="both"/>
-        <w:rPr>
-          <w:highlight w:val="yellow"/>
-        </w:rPr>
-      </w:pPr>
-      <w:r>
         <w:rPr/>
+      </w:pPr>
+      <w:r>
+        <w:lastRenderedPageBreak/>
         <w:t>Review and approve (or delegate to the ONYX controller) bank, credit-card, and loan reconciliations.</w:t>
       </w:r>
     </w:p>
@@ -1434,12 +1243,9 @@
           <w:numId w:val="21"/>
         </w:numPr>
         <w:jc w:val="both"/>
-        <w:rPr>
-          <w:highlight w:val="yellow"/>
-        </w:rPr>
-      </w:pPr>
-      <w:r>
         <w:rPr/>
+      </w:pPr>
+      <w:r>
         <w:t>Maintain responsibility for tax filings and for meeting the Company’s legal and lender obligations.</w:t>
       </w:r>
     </w:p>
@@ -1449,7 +1255,7 @@
         <w:jc w:val="both"/>
       </w:pPr>
       <w:r>
-        <w:t xml:space="preserve">Fees &amp; billing</w:t>
+        <w:t>Fees &amp; billing</w:t>
       </w:r>
     </w:p>
     <w:p>
@@ -1461,31 +1267,10 @@
         <w:t xml:space="preserve">Billing rates guaranteed through </w:t>
       </w:r>
       <w:r>
-        <w:fldChar w:fldCharType="begin">
-          <w:ffData>
-            <w:name w:val="Text30"/>
-            <w:enabled/>
-            <w:calcOnExit w:val="0"/>
-            <w:textInput>
-              <w:default w:val="[Insert date]"/>
-            </w:textInput>
-          </w:ffData>
-        </w:fldChar>
-      </w:r>
-      <w:r>
-        <w:instrText xml:space="preserve"> FORMTEXT </w:instrText>
-      </w:r>
-      <w:r>
-        <w:fldChar w:fldCharType="separate"/>
-      </w:r>
-      <w:r>
         <w:rPr>
           <w:noProof/>
         </w:rPr>
         <w:t>December 31, 2026</w:t>
-      </w:r>
-      <w:r>
-        <w:fldChar w:fldCharType="end"/>
       </w:r>
       <w:r>
         <w:t>:</w:t>
@@ -1501,46 +1286,29 @@
         <w:jc w:val="both"/>
       </w:pPr>
       <w:r>
-        <w:rPr/>
         <w:t>Services performed by Staff Accountant</w:t>
       </w:r>
       <w:r>
-        <w:rPr/>
         <w:tab/>
       </w:r>
       <w:r>
-        <w:rPr/>
         <w:tab/>
       </w:r>
       <w:r>
-        <w:rPr/>
         <w:tab/>
       </w:r>
       <w:r>
-        <w:rPr/>
         <w:tab/>
       </w:r>
       <w:r>
-        <w:rPr/>
         <w:tab/>
       </w:r>
       <w:r>
-        <w:rPr/>
         <w:tab/>
       </w:r>
       <w:r>
-        <w:rPr/>
         <w:tab/>
-      </w:r>
-      <w:proofErr w:type="gramStart"/>
-      <w:r>
-        <w:rPr/>
-        <w:t>$100</w:t>
-      </w:r>
-      <w:proofErr w:type="gramEnd"/>
-      <w:r>
-        <w:rPr/>
-        <w:t xml:space="preserve"> per hour</w:t>
+        <w:t>$100 per hour</w:t>
       </w:r>
     </w:p>
     <w:p>
@@ -1553,32 +1321,30 @@
         <w:jc w:val="both"/>
       </w:pPr>
       <w:r>
-        <w:rPr/>
         <w:t>Services performed by Controller</w:t>
       </w:r>
       <w:r>
-        <w:rPr/>
         <w:tab/>
       </w:r>
       <w:r>
-        <w:rPr/>
         <w:tab/>
       </w:r>
       <w:r>
-        <w:rPr/>
         <w:tab/>
       </w:r>
       <w:r>
-        <w:rPr/>
         <w:tab/>
       </w:r>
       <w:r>
-        <w:rPr/>
         <w:tab/>
       </w:r>
       <w:r>
-        <w:rPr/>
         <w:tab/>
+      </w:r>
+      <w:r>
+        <w:tab/>
+      </w:r>
+      <w:r>
         <w:t>$185 per hour</w:t>
       </w:r>
     </w:p>
@@ -1592,51 +1358,39 @@
         <w:jc w:val="both"/>
       </w:pPr>
       <w:r>
-        <w:rPr/>
         <w:t xml:space="preserve">Services performed by </w:t>
       </w:r>
       <w:r>
-        <w:fldChar w:fldCharType="begin">
-          <w:ffData>
-            <w:name w:val=""/>
-            <w:enabled/>
-            <w:calcOnExit w:val="0"/>
-            <w:textInput>
-              <w:default w:val="CFO"/>
-            </w:textInput>
-          </w:ffData>
-        </w:fldChar>
-      </w:r>
-      <w:r>
-        <w:instrText xml:space="preserve"> FORMTEXT </w:instrText>
-      </w:r>
-      <w:r>
-        <w:fldChar w:fldCharType="separate"/>
-      </w:r>
-      <w:r>
         <w:rPr>
           <w:noProof/>
         </w:rPr>
         <w:t>CFO</w:t>
       </w:r>
       <w:r>
-        <w:fldChar w:fldCharType="end"/>
-      </w:r>
-      <w:r>
-        <w:rPr/>
-        <w:t/>
-      </w:r>
-      <w:r>
-        <w:rPr/>
         <w:tab/>
       </w:r>
       <w:r>
-        <w:rPr/>
         <w:tab/>
       </w:r>
       <w:r>
-        <w:rPr/>
         <w:tab/>
+      </w:r>
+      <w:r>
+        <w:tab/>
+      </w:r>
+      <w:r>
+        <w:tab/>
+      </w:r>
+      <w:r>
+        <w:tab/>
+      </w:r>
+      <w:r>
+        <w:tab/>
+      </w:r>
+      <w:r>
+        <w:tab/>
+      </w:r>
+      <w:r>
         <w:t>$250 per hour</w:t>
       </w:r>
     </w:p>
@@ -1647,60 +1401,46 @@
       </w:pPr>
       <w:proofErr w:type="gramStart"/>
       <w:r>
-        <w:rPr/>
         <w:t>Subsequent to</w:t>
       </w:r>
       <w:proofErr w:type="gramEnd"/>
       <w:r>
-        <w:rPr/>
         <w:t xml:space="preserve"> the billing rate guarantee date, the rates </w:t>
       </w:r>
       <w:r>
-        <w:rPr/>
         <w:t>may be adjusted</w:t>
       </w:r>
       <w:r>
-        <w:rPr/>
         <w:t xml:space="preserve"> only</w:t>
       </w:r>
       <w:r>
-        <w:rPr/>
         <w:t xml:space="preserve"> as </w:t>
       </w:r>
       <w:r>
-        <w:rPr/>
         <w:t>agreed</w:t>
       </w:r>
       <w:r>
-        <w:rPr/>
         <w:t xml:space="preserve"> in writing</w:t>
       </w:r>
       <w:r>
-        <w:rPr/>
         <w:t xml:space="preserve"> between </w:t>
       </w:r>
       <w:r>
-        <w:rPr/>
         <w:t xml:space="preserve">the Client </w:t>
       </w:r>
       <w:r>
-        <w:rPr/>
         <w:t xml:space="preserve">and </w:t>
       </w:r>
       <w:r>
-        <w:rPr/>
         <w:t>ONYX</w:t>
       </w:r>
       <w:r>
-        <w:rPr/>
         <w:t xml:space="preserve"> </w:t>
       </w:r>
       <w:r>
-        <w:rPr/>
         <w:t>through an addendum to this engagement letter</w:t>
       </w:r>
       <w:r>
-        <w:rPr/>
         <w:t>.</w:t>
       </w:r>
     </w:p>
@@ -1736,7 +1476,6 @@
         <w:jc w:val="both"/>
       </w:pPr>
       <w:r>
-        <w:rPr/>
         <w:t>Billed hourly as incurred. ONYX will review the books first, then provide a written scope and ballpark estimate before significant work begins, with weekly progress-and-budget updates throughout so there are no surprises.</w:t>
       </w:r>
     </w:p>
@@ -1749,7 +1488,6 @@
           <w:u w:val="single"/>
         </w:rPr>
       </w:pPr>
-      <w:proofErr w:type="gramStart"/>
       <w:r>
         <w:rPr>
           <w:b w:val="0"/>
@@ -1757,7 +1495,6 @@
         </w:rPr>
         <w:t>Ongoing accounting services:</w:t>
       </w:r>
-      <w:proofErr w:type="gramEnd"/>
     </w:p>
     <w:p>
       <w:pPr>
@@ -1769,89 +1506,71 @@
         <w:jc w:val="both"/>
       </w:pPr>
       <w:r>
-        <w:rPr/>
         <w:t>Billed hourly at the rates above, based on the volume and mix of work once the cleanup is complete and the monthly scope is set.</w:t>
       </w:r>
+      <w:bookmarkStart w:id="5" w:name="Text49"/>
+      <w:bookmarkEnd w:id="5"/>
+    </w:p>
+    <w:p>
+      <w:pPr>
+        <w:pStyle w:val="CLALTRNormal"/>
+        <w:jc w:val="both"/>
+      </w:pPr>
+      <w:r>
+        <w:t>Our fees for these services will be based on the time involved and the degree of responsibility and skill required, plus expenses, including internal and administrative charges. These estimates assume timely cooperation from the Company in providing requested records and access; if requested items are not available when needed or are inaccurate, the fee will likely be higher. Should unexpected circumstances require significant additional time, ONYX will advise the Company before undertaking any work that would substantially increase the fee estimate.</w:t>
+      </w:r>
+    </w:p>
+    <w:p>
+      <w:pPr>
+        <w:pStyle w:val="CLALTRNormal"/>
+        <w:jc w:val="both"/>
+      </w:pPr>
+      <w:r>
+        <w:t xml:space="preserve"> </w:t>
+      </w:r>
       <w:proofErr w:type="gramStart"/>
+      <w:r>
+        <w:t>During the course of</w:t>
+      </w:r>
       <w:proofErr w:type="gramEnd"/>
-      <w:bookmarkStart w:id="7" w:name="Text49"/>
-      <w:bookmarkEnd w:id="7"/>
-    </w:p>
-    <w:p>
-      <w:pPr>
-        <w:pStyle w:val="CLALTRNormal"/>
-        <w:jc w:val="both"/>
-      </w:pPr>
-      <w:r>
-        <w:rPr/>
-        <w:t>Our fees for these services will be based on the time involved and the degree of responsibility and skill required, plus expenses, including internal and administrative charges. These estimates assume timely cooperation from the Company in providing requested records and access; if requested items are not available when needed or are inaccurate, the fee will likely be higher. Should unexpected circumstances require significant additional time, ONYX will advise the Company before undertaking any work that would substantially increase the fee estimate.</w:t>
-      </w:r>
-    </w:p>
-    <w:p>
-      <w:pPr>
-        <w:pStyle w:val="CLALTRNormal"/>
-        <w:jc w:val="both"/>
-      </w:pPr>
-      <w:r>
-        <w:rPr/>
-        <w:t xml:space="preserve"> </w:t>
+      <w:r>
+        <w:t xml:space="preserve"> our engagement, we may incur o</w:t>
+      </w:r>
+      <w:r>
+        <w:t xml:space="preserve">ut-of-pocket </w:t>
+      </w:r>
+      <w:r>
+        <w:t xml:space="preserve">costs and </w:t>
+      </w:r>
+      <w:r>
+        <w:t>expenses</w:t>
+      </w:r>
+      <w:r>
+        <w:t xml:space="preserve"> on your behalf. These costs and </w:t>
+      </w:r>
+      <w:r>
+        <w:t xml:space="preserve">expenses, which you will be responsible </w:t>
       </w:r>
       <w:proofErr w:type="gramStart"/>
       <w:r>
-        <w:rPr/>
-        <w:t>During the course of</w:t>
+        <w:t>to pay</w:t>
       </w:r>
       <w:proofErr w:type="gramEnd"/>
       <w:r>
-        <w:rPr/>
-        <w:t xml:space="preserve"> our engagement, we may incur o</w:t>
-      </w:r>
-      <w:r>
-        <w:rPr/>
-        <w:t xml:space="preserve">ut-of-pocket </w:t>
-      </w:r>
-      <w:r>
-        <w:rPr/>
-        <w:t xml:space="preserve">costs and </w:t>
-      </w:r>
-      <w:r>
-        <w:rPr/>
-        <w:t>expenses</w:t>
-      </w:r>
-      <w:r>
-        <w:rPr/>
-        <w:t xml:space="preserve"> on your behalf. These costs and </w:t>
-      </w:r>
-      <w:r>
-        <w:rPr/>
-        <w:t xml:space="preserve">expenses, which you will be responsible </w:t>
+        <w:t xml:space="preserve">, include, but are not necessarily limited </w:t>
       </w:r>
       <w:proofErr w:type="gramStart"/>
       <w:r>
-        <w:rPr/>
-        <w:t>to pay</w:t>
+        <w:t>to,</w:t>
       </w:r>
       <w:proofErr w:type="gramEnd"/>
       <w:r>
-        <w:rPr/>
-        <w:t xml:space="preserve">, include, but are not necessarily limited </w:t>
-      </w:r>
-      <w:proofErr w:type="gramStart"/>
-      <w:r>
-        <w:rPr/>
-        <w:t>to,</w:t>
-      </w:r>
-      <w:proofErr w:type="gramEnd"/>
-      <w:r>
-        <w:rPr/>
         <w:t xml:space="preserve"> out-of-town travel, meals, and lodging</w:t>
       </w:r>
       <w:r>
-        <w:rPr/>
         <w:t>. These out-of-pocket costs and expenses</w:t>
       </w:r>
       <w:r>
-        <w:rPr/>
         <w:t xml:space="preserve"> will be billed at cost and are not included in the fees quoted above.</w:t>
       </w:r>
     </w:p>
@@ -1861,11 +1580,7 @@
         <w:jc w:val="both"/>
       </w:pPr>
       <w:r>
-        <w:t xml:space="preserve">Our invoices for these fees will be </w:t>
-      </w:r>
-      <w:proofErr w:type="gramStart"/>
-      <w:r>
-        <w:t xml:space="preserve">rendered </w:t>
+        <w:t xml:space="preserve">Our invoices for these fees will be rendered </w:t>
       </w:r>
       <w:r>
         <w:rPr>
@@ -1873,16 +1588,7 @@
           <w:bCs/>
           <w:u w:val="single"/>
         </w:rPr>
-        <w:t>bi</w:t>
-      </w:r>
-      <w:proofErr w:type="gramEnd"/>
-      <w:r>
-        <w:rPr>
-          <w:b/>
-          <w:bCs/>
-          <w:u w:val="single"/>
-        </w:rPr>
-        <w:t>-weekly</w:t>
+        <w:t>bi-weekly</w:t>
       </w:r>
       <w:r>
         <w:t xml:space="preserve"> as work progresses and are payable on presentation. </w:t>
@@ -2038,33 +1744,12 @@
         <w:t xml:space="preserve">with the </w:t>
       </w:r>
       <w:r>
-        <w:fldChar w:fldCharType="begin">
-          <w:ffData>
-            <w:name w:val=""/>
-            <w:enabled/>
-            <w:calcOnExit w:val="0"/>
-            <w:textInput>
-              <w:default w:val="[identify the work product]"/>
-            </w:textInput>
-          </w:ffData>
-        </w:fldChar>
-      </w:r>
-      <w:r>
-        <w:instrText xml:space="preserve"> FORMTEXT </w:instrText>
-      </w:r>
-      <w:r>
-        <w:fldChar w:fldCharType="separate"/>
-      </w:r>
-      <w:r>
         <w:rPr>
           <w:noProof/>
         </w:rPr>
         <w:t>the books and supporting schedules</w:t>
       </w:r>
       <w:r>
-        <w:fldChar w:fldCharType="end"/>
-      </w:r>
-      <w:r>
         <w:t xml:space="preserve">. </w:t>
       </w:r>
       <w:r>
@@ -2101,6 +1786,7 @@
         <w:jc w:val="both"/>
       </w:pPr>
       <w:r>
+        <w:lastRenderedPageBreak/>
         <w:t xml:space="preserve">If the Client disputes or questions any charges on </w:t>
       </w:r>
       <w:r>
@@ -2115,15 +1801,7 @@
         <w:t xml:space="preserve"> IN WRITING, listing the specific time entries or costs on the invoices the Client is disputing within thirty (30) days of the date shown on the invoice. If ONYX does not receive written notice of any such dispute or question within thirty (30) days of the date shown on the invoice, then ONYX will understand the Client’s silence to mean that the Client </w:t>
       </w:r>
       <w:r>
-        <w:t xml:space="preserve">finds the billing statement, and </w:t>
-      </w:r>
-      <w:proofErr w:type="gramStart"/>
-      <w:r>
-        <w:t>all of</w:t>
-      </w:r>
-      <w:proofErr w:type="gramEnd"/>
-      <w:r>
-        <w:t xml:space="preserve"> its itemized charges and costs, acceptable and reasonable.</w:t>
+        <w:t>finds the billing statement, and all of its itemized charges and costs, acceptable and reasonable.</w:t>
       </w:r>
     </w:p>
     <w:p>
@@ -2132,7 +1810,6 @@
         <w:jc w:val="both"/>
       </w:pPr>
       <w:r>
-        <w:rPr/>
         <w:t>Retainer</w:t>
       </w:r>
     </w:p>
@@ -2142,73 +1819,25 @@
         <w:jc w:val="both"/>
       </w:pPr>
       <w:r>
-        <w:rPr/>
         <w:t xml:space="preserve">In connection with this engagement, </w:t>
       </w:r>
       <w:r>
-        <w:rPr/>
         <w:t>ONYX</w:t>
       </w:r>
       <w:r>
-        <w:rPr/>
         <w:t xml:space="preserve"> </w:t>
       </w:r>
       <w:r>
-        <w:rPr/>
         <w:t>must receive a retainer in the initial amount of</w:t>
       </w:r>
       <w:r>
-        <w:rPr/>
         <w:t xml:space="preserve"> </w:t>
       </w:r>
       <w:r>
-        <w:rPr/>
         <w:t>$</w:t>
       </w:r>
       <w:r>
-        <w:rPr>
-          <w:b/>
-          <w:i/>
-        </w:rPr>
-        <w:fldChar w:fldCharType="begin">
-          <w:ffData>
-            <w:name w:val=""/>
-            <w:enabled/>
-            <w:calcOnExit w:val="0"/>
-            <w:textInput>
-              <w:default w:val="[insert amount]"/>
-            </w:textInput>
-          </w:ffData>
-        </w:fldChar>
-      </w:r>
-      <w:r>
-        <w:instrText xml:space="preserve"> FORMTEXT </w:instrText>
-      </w:r>
-      <w:r>
-        <w:rPr>
-          <w:b/>
-          <w:i/>
-        </w:rPr>
-      </w:r>
-      <w:r>
-        <w:rPr>
-          <w:b/>
-          <w:i/>
-        </w:rPr>
-        <w:fldChar w:fldCharType="separate"/>
-      </w:r>
-      <w:r>
-        <w:rPr>
-          <w:noProof/>
-        </w:rPr>
-        <w:t>[insert amount]</w:t>
-      </w:r>
-      <w:r>
-        <w:rPr>
-          <w:b/>
-          <w:i/>
-        </w:rPr>
-        <w:fldChar w:fldCharType="end"/>
+        <w:t>2,500</w:t>
       </w:r>
       <w:r>
         <w:rPr>
@@ -2218,75 +1847,57 @@
         <w:t xml:space="preserve"> (the “Retainer”)</w:t>
       </w:r>
       <w:r>
-        <w:rPr/>
         <w:t>, payable prior to the commencement of any services.</w:t>
       </w:r>
       <w:r>
-        <w:rPr/>
         <w:t xml:space="preserve"> </w:t>
       </w:r>
       <w:r>
-        <w:rPr/>
         <w:t xml:space="preserve">The Client expressly grants ONYX a possessory security interest </w:t>
       </w:r>
       <w:r>
-        <w:rPr/>
         <w:t>in the</w:t>
       </w:r>
       <w:r>
-        <w:rPr/>
         <w:t xml:space="preserve"> Retainer</w:t>
       </w:r>
       <w:r>
-        <w:rPr/>
         <w:t xml:space="preserve"> to secure the payment of ONYX’s fees and costs. The Client also authorizes ONYX to withdraw from the Retainer any sums necessary to </w:t>
       </w:r>
       <w:r>
-        <w:rPr/>
         <w:t>pay fees charged, and costs incurred, from ONYX’s engagement.</w:t>
       </w:r>
       <w:r>
-        <w:rPr/>
         <w:t xml:space="preserve"> </w:t>
       </w:r>
       <w:r>
-        <w:rPr/>
         <w:t>T</w:t>
       </w:r>
       <w:r>
-        <w:rPr/>
         <w:t xml:space="preserve">he </w:t>
       </w:r>
       <w:r>
-        <w:rPr/>
         <w:t>R</w:t>
       </w:r>
       <w:r>
-        <w:rPr/>
         <w:t xml:space="preserve">etainer will be applied to </w:t>
       </w:r>
       <w:r>
-        <w:rPr/>
         <w:t>ONYX’s</w:t>
       </w:r>
       <w:r>
-        <w:rPr/>
         <w:t xml:space="preserve"> </w:t>
       </w:r>
       <w:r>
-        <w:rPr/>
         <w:t>final invoice</w:t>
       </w:r>
       <w:r>
-        <w:rPr/>
         <w:t>. The Client must also still pay any remaining balance due to ONYX</w:t>
       </w:r>
       <w:r>
-        <w:rPr/>
         <w:t xml:space="preserve"> after the Retainer is applied to the final invoice. We will refund to the Client any unearned balance remaining from the Retainer when we conclude our engagement</w:t>
       </w:r>
       <w:r>
-        <w:rPr/>
         <w:t>.</w:t>
       </w:r>
     </w:p>
@@ -2296,7 +1907,6 @@
         <w:jc w:val="both"/>
       </w:pPr>
       <w:r>
-        <w:lastRenderedPageBreak/>
         <w:t>Other fees</w:t>
       </w:r>
     </w:p>
@@ -2387,37 +1997,13 @@
         <w:t xml:space="preserve">billing </w:t>
       </w:r>
       <w:r>
-        <w:t xml:space="preserve">date, the unpaid balance shall accrue interest at the monthly rate of one and one-quarter percent (1.25%), which is an annual percentage rate of 15%. </w:t>
-      </w:r>
-      <w:proofErr w:type="gramStart"/>
-      <w:r>
-        <w:t>In the event that</w:t>
-      </w:r>
-      <w:proofErr w:type="gramEnd"/>
-      <w:r>
-        <w:t xml:space="preserve"> any collection action is required to collect unpaid balances </w:t>
-      </w:r>
-      <w:proofErr w:type="gramStart"/>
-      <w:r>
-        <w:t>due</w:t>
-      </w:r>
-      <w:proofErr w:type="gramEnd"/>
-      <w:r>
-        <w:t xml:space="preserve"> us, </w:t>
+        <w:t xml:space="preserve">date, the unpaid balance shall accrue interest at the monthly rate of one and one-quarter percent (1.25%), which is an annual percentage rate of 15%. In the event that any collection action is required to collect unpaid balances due us, </w:t>
       </w:r>
       <w:r>
         <w:t xml:space="preserve">then the Client agrees that ONYX (or any attorney that ONYX may hire for this purpose) may also recover from the Client the </w:t>
       </w:r>
       <w:r>
-        <w:t xml:space="preserve">attorneys’ fees and costs to collect such sums, </w:t>
-      </w:r>
-      <w:proofErr w:type="gramStart"/>
-      <w:r>
-        <w:t>whether or not</w:t>
-      </w:r>
-      <w:proofErr w:type="gramEnd"/>
-      <w:r>
-        <w:t xml:space="preserve"> the Client contests the matter.</w:t>
+        <w:t>attorneys’ fees and costs to collect such sums, whether or not the Client contests the matter.</w:t>
       </w:r>
     </w:p>
     <w:p>
@@ -2426,25 +2012,25 @@
         <w:jc w:val="both"/>
       </w:pPr>
       <w:r>
-        <w:t xml:space="preserve">Our service commitment</w:t>
-      </w:r>
-    </w:p>
-    <w:p>
-      <w:pPr>
-        <w:pStyle w:val="CLALTRNormal"/>
-        <w:jc w:val="both"/>
-      </w:pPr>
-      <w:r>
-        <w:t xml:space="preserve">We stand behind our work. Upon full payment of our invoice, we will consider you satisfied with our services and our service commitment fulfilled.</w:t>
-      </w:r>
-    </w:p>
-    <w:p>
-      <w:pPr>
-        <w:pStyle w:val="CLALTRNormal"/>
-        <w:jc w:val="both"/>
-      </w:pPr>
-      <w:r>
-        <w:t xml:space="preserve">To ensure that ONYX’s services remain responsive to the Client’s needs, and fair to both parties, ONYX will meet with the Client throughout the term of this agreement and, as needs change, revise or adjust the scope of services and the related fees — without the need to re-execute this agreement. Such revisions or adjustments take effect once confirmed in writing, including by email, by both ONYX and the Client; no signature, formal addendum, or re-execution of this agreement is required.</w:t>
+        <w:t>Our service commitment</w:t>
+      </w:r>
+    </w:p>
+    <w:p>
+      <w:pPr>
+        <w:pStyle w:val="CLALTRNormal"/>
+        <w:jc w:val="both"/>
+      </w:pPr>
+      <w:r>
+        <w:t>We stand behind our work. Upon full payment of our invoice, we will consider you satisfied with our services and our service commitment fulfilled.</w:t>
+      </w:r>
+    </w:p>
+    <w:p>
+      <w:pPr>
+        <w:pStyle w:val="CLALTRNormal"/>
+        <w:jc w:val="both"/>
+      </w:pPr>
+      <w:r>
+        <w:t>To ensure that ONYX’s services remain responsive to the Client’s needs, and fair to both parties, ONYX will meet with the Client throughout the term of this agreement and, as needs change, revise or adjust the scope of services and the related fees — without the need to re-execute this agreement. Such revisions or adjustments take effect once confirmed in writing, including by email, by both ONYX and the Client; no signature, formal addendum, or re-execution of this agreement is required.</w:t>
       </w:r>
     </w:p>
     <w:p>
@@ -2497,11 +2083,12 @@
         <w:rPr>
           <w:caps/>
           <w:color w:val="7F7F7F"/>
+          <w:spacing w:val="60"/>
           <w:sz w:val="18"/>
           <w:szCs w:val="18"/>
-          <w:spacing w:val="60"/>
-        </w:rPr>
-        <w:t xml:space="preserve">Section 2</w:t>
+        </w:rPr>
+        <w:lastRenderedPageBreak/>
+        <w:t>Section 2</w:t>
       </w:r>
       <w:r>
         <w:br/>
@@ -2511,16 +2098,16 @@
           <w:sz w:val="48"/>
           <w:szCs w:val="48"/>
         </w:rPr>
-        <w:t xml:space="preserve">Terms and Conditions</w:t>
-      </w:r>
-    </w:p>
-    <w:p>
-      <w:pPr>
-        <w:pStyle w:val="CLALTRNormal"/>
-        <w:jc w:val="both"/>
-      </w:pPr>
-      <w:r>
-        <w:t xml:space="preserve">The following terms govern our engagement. They define each party’s responsibilities, allocate risk between us, and explain how any questions or disputes will be handled.</w:t>
+        <w:t>Terms and Conditions</w:t>
+      </w:r>
+    </w:p>
+    <w:p>
+      <w:pPr>
+        <w:pStyle w:val="CLALTRNormal"/>
+        <w:jc w:val="both"/>
+      </w:pPr>
+      <w:r>
+        <w:t>The following terms govern our engagement. They define each party’s responsibilities, allocate risk between us, and explain how any questions or disputes will be handled.</w:t>
       </w:r>
     </w:p>
     <w:p>
@@ -2538,7 +2125,7 @@
         <w:jc w:val="both"/>
       </w:pPr>
       <w:r>
-        <w:t xml:space="preserve">The objective of ONYX’s engagement is to assist the Client in the preparation of financial statements by providing the services identified above. ONYX has not been engaged to prepare financial statements, and financial statements will not be presented to the Client. Financial statements that may be generated from the Client’s accounting system have not been prepared, compiled, reviewed, or audited by ONYX and, accordingly, will not include an opinion or any other form of assurance. The financial statements will not be accompanied by a report, and ONYX should not be discussed or associated with them. Any analysis or presentation of financial information that ONYX provides to management is based on financial statements generated from the Client’s accounting system and does not constitute the preparation, compilation, review, or audit of financial statements by ONYX.</w:t>
+        <w:t>The objective of ONYX’s engagement is to assist the Client in the preparation of financial statements by providing the services identified above. ONYX has not been engaged to prepare financial statements, and financial statements will not be presented to the Client. Financial statements that may be generated from the Client’s accounting system have not been prepared, compiled, reviewed, or audited by ONYX and, accordingly, will not include an opinion or any other form of assurance. The financial statements will not be accompanied by a report, and ONYX should not be discussed or associated with them. Any analysis or presentation of financial information that ONYX provides to management is based on financial statements generated from the Client’s accounting system and does not constitute the preparation, compilation, review, or audit of financial statements by ONYX.</w:t>
       </w:r>
     </w:p>
     <w:p>
@@ -2799,15 +2386,7 @@
         <w:t xml:space="preserve"> </w:t>
       </w:r>
       <w:r>
-        <w:t xml:space="preserve">shall not be responsible for any </w:t>
-      </w:r>
-      <w:proofErr w:type="gramStart"/>
-      <w:r>
-        <w:t>misstatements</w:t>
-      </w:r>
-      <w:proofErr w:type="gramEnd"/>
-      <w:r>
-        <w:t xml:space="preserve"> in the </w:t>
+        <w:t xml:space="preserve">shall not be responsible for any misstatements in the </w:t>
       </w:r>
       <w:r>
         <w:t>Client’s</w:t>
@@ -2888,572 +2467,571 @@
         <w:t>business entity</w:t>
       </w:r>
       <w:r>
-        <w:t xml:space="preserve">, then ONYX does NOT also represent any of the Client’s individual partners, members, officers, directors or employees (as the case may be) or any other entities whose interests are represented by those </w:t>
+        <w:t>, then ONYX does NOT also represent any of the Client’s individual partners, members, officers, directors or employees (as the case may be) or any other entities whose interests are represented by those persons, unless ONYX agrees to do so in writing.</w:t>
+      </w:r>
+    </w:p>
+    <w:p>
+      <w:pPr>
+        <w:pStyle w:val="CLALTRNormal"/>
+        <w:jc w:val="both"/>
+      </w:pPr>
+      <w:r>
+        <w:t xml:space="preserve">If the Client is a business entity, </w:t>
+      </w:r>
+      <w:r>
+        <w:t>then, for the convenience of all involved, you have authorized the persons designated in this letter to act for you in a representative capacity in communicating your instructions to us.</w:t>
+      </w:r>
+    </w:p>
+    <w:p>
+      <w:pPr>
+        <w:pStyle w:val="CLALTRHeading2"/>
+        <w:jc w:val="both"/>
+      </w:pPr>
+      <w:r>
+        <w:lastRenderedPageBreak/>
+        <w:t>Client indemnification</w:t>
+      </w:r>
+    </w:p>
+    <w:p>
+      <w:pPr>
+        <w:pStyle w:val="CLALTRNormal"/>
+        <w:jc w:val="both"/>
+      </w:pPr>
+      <w:r>
+        <w:t>Client shall indemnify, defend, and hold harmless ONYX, its partners, principals, directors, officers, employees, agents, subcontractors, and affiliates (collectively, the “ONYX Parties” and each an “ONYX Party”) from and against any and all third-party claims, demands, actions, damages, losses, liabilities, penalties, fines, judgments, costs, and expenses, including reasonable attorneys’ fees and defense costs, arising out of or relating to: (a) information, records, or data provided by Client that is inaccurate, incomplete, misleading, or untimely; (b) instructions, approvals, authorizations, or decisions made by Client or its representatives; (c) Client’s failure to maintain adequate internal controls, oversight, or segregation of duties; (d) payments, wire transfers, payroll transactions, vendor setups, customer setups, or other financial transactions approved by Client; (e) acts or omissions of Client’s employees, officers, owners, agents, contractors, or other service providers; or (f) Client’s violation of any applicable law, regulation, contract, or legal obligation. This indemnification obligation shall not apply to the extent a claim is finally determined by a court or arbitrator of competent jurisdiction to have resulted from the gross negligence or willful misconduct of an ONYX Party.</w:t>
+      </w:r>
+    </w:p>
+    <w:p>
+      <w:pPr>
+        <w:pStyle w:val="CLALTRHeading1"/>
+        <w:jc w:val="both"/>
+      </w:pPr>
+      <w:r>
+        <w:t>Limitation of remedies</w:t>
+      </w:r>
+    </w:p>
+    <w:p>
+      <w:pPr>
+        <w:pStyle w:val="CLALTRNormal"/>
+        <w:jc w:val="both"/>
+      </w:pPr>
+      <w:r>
+        <w:t>ONYX’s role is strictly limited to the engagement described in this letter, and ONYX offers no assurance as to the results or ultimate outcomes of this engagement or of any decisions that the Client may make based on ONYX’s communications with the Client. The Client agrees that it is appropriate to limit the liability of the ONYX Parties.</w:t>
+      </w:r>
+    </w:p>
+    <w:p>
+      <w:pPr>
+        <w:pStyle w:val="CLALTRNormal"/>
+        <w:jc w:val="both"/>
+      </w:pPr>
+      <w:r>
+        <w:t>If a dispute arises from or relates to this agreement or the breach thereof, and if the dispute cannot be settled through direct discussions, the parties agree to endeavor first to settle the dispute by mediation administered by the American Arbitration Association</w:t>
+      </w:r>
+      <w:r>
+        <w:t xml:space="preserve"> in Maricopa County, Arizona</w:t>
+      </w:r>
+      <w:r>
+        <w:t xml:space="preserve"> under its Commercial Mediation Procedures before resorting to arbitration. The parties further agree that any unresolved controversy or claim arising out of or relating to this agreement, or breach thereof, shall be settled by arbitration administered by the American Arbitration Association</w:t>
+      </w:r>
+      <w:r>
+        <w:t xml:space="preserve"> in Maricopa County, Arizona</w:t>
+      </w:r>
+      <w:r>
+        <w:t xml:space="preserve"> in accordance with its Commercial Arbitration Rules and judgment on the award rendered by the arbitrator(s) may be entered in any court having jurisdiction thereof.</w:t>
+      </w:r>
+    </w:p>
+    <w:p>
+      <w:pPr>
+        <w:pStyle w:val="CLALTRNormal"/>
+        <w:jc w:val="both"/>
+      </w:pPr>
+      <w:r>
+        <w:t>Each person signing this letter agrees (1) that this agreement is entered into in the State of Arizona, (2) that Arizona law governs this agreement, and (</w:t>
+      </w:r>
+      <w:r>
+        <w:t>3</w:t>
+      </w:r>
+      <w:r>
+        <w:t>) each such person consents to the personal jurisdiction of the courts of Maricopa County, Arizona.</w:t>
+      </w:r>
+      <w:r>
+        <w:rPr>
+          <w:rStyle w:val="CLALTRHiddenTextChar"/>
+        </w:rPr>
+        <w:t xml:space="preserve"> </w:t>
+      </w:r>
+      <w:r>
+        <w:rPr>
+          <w:rStyle w:val="CLALTRHiddenTextChar"/>
+        </w:rPr>
+        <w:t xml:space="preserve">  </w:t>
+      </w:r>
+    </w:p>
+    <w:p>
+      <w:pPr>
+        <w:pStyle w:val="CLALTRNormal"/>
+        <w:jc w:val="both"/>
+      </w:pPr>
+      <w:r>
+        <w:t>The Client further agrees that it will not hold ONYX or any other ONYX Party liable for any claim, cost, or damage, whether based on warranty, tort, contract, or other law, arising from or related to this agreement, the services provided under this agreement, the work product, or for any plans, actions, or results of this engagement, except to the extent authorized by this agreement.</w:t>
+      </w:r>
+    </w:p>
+    <w:p>
+      <w:pPr>
+        <w:pStyle w:val="CLALTRNormal"/>
+        <w:jc w:val="both"/>
+      </w:pPr>
+      <w:r>
+        <w:t>To the fullest extent permitted by law, the aggregate liability of all ONYX Parties arising out of or relating to this agreement, the services provided under this agreement, or any work product delivered pursuant to this agreement, regardless of the form of action and whether based in contract, tort, negligence, strict liability, statute, fiduciary theory, or otherwise, shall not exceed the total fees actually paid by Client to ONYX under this agreement during the twelve (12) months immediately preceding the event giving rise to the claim.</w:t>
+      </w:r>
+    </w:p>
+    <w:p>
+      <w:pPr>
+        <w:pStyle w:val="CLALTRNormal"/>
+        <w:jc w:val="both"/>
+      </w:pPr>
+      <w:r>
+        <w:t xml:space="preserve">In no event shall any ONYX Party be liable for any indirect, consequential, special, incidental, exemplary, enhanced, or punitive damages, including without limitation loss of profits, loss of revenue, loss of business opportunity, loss </w:t>
+      </w:r>
+      <w:r>
+        <w:lastRenderedPageBreak/>
+        <w:t>of anticipated savings, loss of data, loss of goodwill, business interruption losses, or attorneys’ fees and costs, regardless of the legal theory asserted and even if advised of the possibility of such damages.</w:t>
+      </w:r>
+    </w:p>
+    <w:p>
+      <w:pPr>
+        <w:pStyle w:val="CLALTRNormal"/>
+        <w:jc w:val="both"/>
+      </w:pPr>
+    </w:p>
+    <w:p>
+      <w:pPr>
+        <w:pStyle w:val="CLALTRNormal"/>
+        <w:jc w:val="both"/>
+      </w:pPr>
+    </w:p>
+    <w:p>
+      <w:pPr>
+        <w:pStyle w:val="CLALTRHeading1"/>
+        <w:jc w:val="both"/>
+      </w:pPr>
+      <w:r>
+        <w:t>Time limitation</w:t>
+      </w:r>
+    </w:p>
+    <w:p>
+      <w:pPr>
+        <w:pStyle w:val="CLALTRNormal"/>
+        <w:jc w:val="both"/>
+      </w:pPr>
+      <w:r>
+        <w:t xml:space="preserve">The nature of our services makes it difficult, with the passage of time, to gather and present evidence that fully and fairly establishes the facts underlying any dispute that may arise between </w:t>
+      </w:r>
+      <w:r>
+        <w:t xml:space="preserve">the Client </w:t>
+      </w:r>
+      <w:r>
+        <w:t xml:space="preserve">and any </w:t>
+      </w:r>
+      <w:r>
+        <w:t>ONYX</w:t>
+      </w:r>
+      <w:r>
+        <w:t xml:space="preserve"> </w:t>
+      </w:r>
+      <w:r>
+        <w:t>P</w:t>
+      </w:r>
+      <w:r>
+        <w:t xml:space="preserve">arty. The </w:t>
+      </w:r>
+      <w:r>
+        <w:t>Client and ONYX</w:t>
+      </w:r>
+      <w:r>
+        <w:t xml:space="preserve"> agree that, notwithstanding any statute or law of limitations that might otherwise apply to a dispute, including one arising out of this agreement or the services performed under this agreement, for breach of contract or fiduciary duty, tort, fraud, misrepresentation or any other cause of action or remedy, any action or legal proceeding by </w:t>
+      </w:r>
+      <w:r>
+        <w:t xml:space="preserve">the Client </w:t>
+      </w:r>
+      <w:r>
+        <w:t xml:space="preserve">against any </w:t>
+      </w:r>
+      <w:r>
+        <w:t>ONYX</w:t>
+      </w:r>
+      <w:r>
+        <w:t xml:space="preserve"> </w:t>
+      </w:r>
+      <w:r>
+        <w:t>P</w:t>
+      </w:r>
+      <w:r>
+        <w:t xml:space="preserve">arty must be commenced separately </w:t>
+      </w:r>
+      <w:r>
+        <w:t xml:space="preserve">within twenty-four (24) </w:t>
+      </w:r>
+      <w:r>
+        <w:t xml:space="preserve">months after the date when </w:t>
+      </w:r>
+      <w:r>
+        <w:t xml:space="preserve">ONYX </w:t>
+      </w:r>
+      <w:r>
+        <w:t>deliver</w:t>
+      </w:r>
+      <w:r>
+        <w:t>s</w:t>
+      </w:r>
+      <w:r>
+        <w:t xml:space="preserve"> such services under this agreement to </w:t>
+      </w:r>
+      <w:r>
+        <w:t xml:space="preserve">the Client </w:t>
+      </w:r>
+      <w:r>
+        <w:t>on which the dispute is based</w:t>
+      </w:r>
+      <w:r>
+        <w:t xml:space="preserve"> (the “Limitation Period”)</w:t>
+      </w:r>
+      <w:r>
+        <w:t xml:space="preserve">, regardless of whether any </w:t>
+      </w:r>
+      <w:r>
+        <w:t>ONYX</w:t>
+      </w:r>
+      <w:r>
+        <w:t xml:space="preserve"> </w:t>
+      </w:r>
+      <w:r>
+        <w:t>P</w:t>
+      </w:r>
+      <w:r>
+        <w:t xml:space="preserve">arty provides other services for </w:t>
+      </w:r>
+      <w:r>
+        <w:t xml:space="preserve">the Client </w:t>
+      </w:r>
+      <w:r>
+        <w:t xml:space="preserve">under this agreement, or </w:t>
+      </w:r>
+      <w:r>
+        <w:t xml:space="preserve">the Client </w:t>
+      </w:r>
+      <w:r>
+        <w:t>shall be forever barred from commencing a lawsuit or obtaining any legal or equitable relief or recovery</w:t>
+      </w:r>
+      <w:r>
+        <w:t xml:space="preserve"> against any ONYX Party</w:t>
+      </w:r>
+      <w:r>
+        <w:t>.</w:t>
+      </w:r>
+      <w:r>
+        <w:t xml:space="preserve"> </w:t>
+      </w:r>
+    </w:p>
+    <w:p>
+      <w:pPr>
+        <w:pStyle w:val="CLALTRNormal"/>
+        <w:jc w:val="both"/>
+      </w:pPr>
+      <w:r>
+        <w:t xml:space="preserve">The Limitation Period applies and begins to run even if </w:t>
+      </w:r>
+      <w:r>
+        <w:t xml:space="preserve">the Client </w:t>
+      </w:r>
+      <w:r>
+        <w:t>ha</w:t>
+      </w:r>
+      <w:r>
+        <w:t>s</w:t>
+      </w:r>
+      <w:r>
+        <w:t xml:space="preserve"> not suffered any damage or loss or ha</w:t>
+      </w:r>
+      <w:r>
+        <w:t>s</w:t>
+      </w:r>
+      <w:r>
+        <w:t xml:space="preserve"> not become aware of the existence or possible existence of a dispute.</w:t>
+      </w:r>
+    </w:p>
+    <w:p>
+      <w:pPr>
+        <w:pStyle w:val="CLALTRHeading1"/>
+        <w:jc w:val="both"/>
+      </w:pPr>
+      <w:r>
+        <w:t>Other provisions</w:t>
+      </w:r>
+    </w:p>
+    <w:p>
+      <w:pPr>
+        <w:pStyle w:val="CLALTRNormal"/>
+        <w:jc w:val="both"/>
+      </w:pPr>
+      <w:r>
+        <w:t>Except as permitted by the “Consent” section of this agreement,</w:t>
+      </w:r>
+      <w:r>
+        <w:t xml:space="preserve"> </w:t>
+      </w:r>
+      <w:r>
+        <w:t>ONYX</w:t>
+      </w:r>
+      <w:r>
+        <w:t xml:space="preserve"> will not disclose any confidential, proprietary, or privileged information of the entity to any persons without the </w:t>
+      </w:r>
+      <w:r>
+        <w:t xml:space="preserve">Client’s </w:t>
+      </w:r>
+      <w:r>
+        <w:t>authorization or unless required by law.</w:t>
+      </w:r>
+      <w:r>
+        <w:t xml:space="preserve"> </w:t>
+      </w:r>
+      <w:r>
+        <w:t xml:space="preserve">This confidentiality provision does not prohibit </w:t>
+      </w:r>
+      <w:r>
+        <w:t xml:space="preserve">ONYX </w:t>
+      </w:r>
+      <w:r>
+        <w:t xml:space="preserve">from disclosing </w:t>
+      </w:r>
+      <w:r>
+        <w:t xml:space="preserve">the Client’s </w:t>
+      </w:r>
+      <w:r>
+        <w:t xml:space="preserve">information to one or more of our affiliated companies </w:t>
       </w:r>
       <w:proofErr w:type="gramStart"/>
       <w:r>
-        <w:t>persons</w:t>
+        <w:t>in order to</w:t>
       </w:r>
       <w:proofErr w:type="gramEnd"/>
       <w:r>
-        <w:t>, unless ONYX agrees to do so in writing.</w:t>
-      </w:r>
-    </w:p>
-    <w:p>
-      <w:pPr>
-        <w:pStyle w:val="CLALTRNormal"/>
-        <w:jc w:val="both"/>
-      </w:pPr>
-      <w:r>
-        <w:t xml:space="preserve">If the Client is a business entity, </w:t>
-      </w:r>
-      <w:r>
-        <w:t>then, for the convenience of all involved, you have authorized the persons designated in this letter to act for you in a representative capacity in communicating your instructions to us.</w:t>
-      </w:r>
-    </w:p>
-    <w:p>
-      <w:pPr>
-        <w:pStyle w:val="CLALTRHeading2"/>
-        <w:jc w:val="both"/>
-      </w:pPr>
-      <w:r>
-        <w:t xml:space="preserve">Client indemnification</w:t>
-      </w:r>
-    </w:p>
-    <w:p>
-      <w:pPr>
-        <w:pStyle w:val="CLALTRNormal"/>
-        <w:jc w:val="both"/>
-      </w:pPr>
-      <w:r>
-        <w:t xml:space="preserve">Client shall indemnify, defend, and hold harmless ONYX, its partners, principals, directors, officers, employees, agents, subcontractors, and affiliates (collectively, the “ONYX Parties” and each an “ONYX Party”) from and against any and all third-party claims, demands, actions, damages, losses, liabilities, penalties, fines, judgments, costs, and expenses, including reasonable attorneys’ fees and defense costs, arising out of or relating to: (a) information, records, or data provided by Client that is inaccurate, incomplete, misleading, or untimely; (b) instructions, approvals, authorizations, or decisions made by Client or its representatives; (c) Client’s failure to maintain adequate internal controls, oversight, or segregation of duties; (d) payments, wire transfers, payroll transactions, vendor setups, customer setups, or other financial transactions approved by Client; (e) acts or omissions of Client’s employees, officers, owners, agents, contractors, or other service providers; or (f) Client’s violation of any applicable law, regulation, contract, or legal obligation. This indemnification obligation shall not apply to the extent a claim is finally determined by a court or arbitrator of competent jurisdiction to have resulted from the gross negligence or willful misconduct of an ONYX Party.</w:t>
-      </w:r>
-    </w:p>
-    <w:p>
-      <w:pPr>
-        <w:pStyle w:val="CLALTRHeading1"/>
-        <w:jc w:val="both"/>
-      </w:pPr>
-      <w:r>
-        <w:t>Limitation of remedies</w:t>
-      </w:r>
-    </w:p>
-    <w:p>
-      <w:pPr>
-        <w:pStyle w:val="CLALTRNormal"/>
-        <w:jc w:val="both"/>
-      </w:pPr>
-      <w:r>
-        <w:t xml:space="preserve">ONYX’s role is strictly limited to the engagement described in this letter, and ONYX offers no assurance as to the results or ultimate outcomes of this engagement or of any decisions that the Client may make based on ONYX’s communications with the Client. The Client agrees that it is appropriate to limit the liability of the ONYX Parties.</w:t>
-      </w:r>
-    </w:p>
-    <w:p>
-      <w:pPr>
-        <w:pStyle w:val="CLALTRNormal"/>
-        <w:jc w:val="both"/>
-      </w:pPr>
-      <w:r>
-        <w:t>If a dispute arises from or relates to this agreement or the breach thereof, and if the dispute cannot be settled through direct discussions, the parties agree to endeavor first to settle the dispute by mediation administered by the American Arbitration Association</w:t>
-      </w:r>
-      <w:r>
-        <w:t xml:space="preserve"> in Maricopa County, Arizona</w:t>
-      </w:r>
-      <w:r>
-        <w:t xml:space="preserve"> under its Commercial Mediation Procedures before resorting to arbitration. The parties further agree that any unresolved controversy or claim arising out of or relating to this agreement, or breach thereof, shall be settled by arbitration administered by the American Arbitration Association</w:t>
-      </w:r>
-      <w:r>
-        <w:t xml:space="preserve"> in Maricopa County, Arizona</w:t>
-      </w:r>
-      <w:r>
-        <w:t xml:space="preserve"> in accordance with its Commercial Arbitration Rules and judgment on the award rendered by the arbitrator(s) may be entered in any court having jurisdiction thereof.</w:t>
-      </w:r>
-    </w:p>
-    <w:p>
-      <w:pPr>
-        <w:pStyle w:val="CLALTRNormal"/>
-        <w:jc w:val="both"/>
-      </w:pPr>
-      <w:r>
-        <w:t>Each person signing this letter agrees (1) that this agreement is entered into in the State of Arizona, (2) that Arizona law governs this agreement, and (</w:t>
-      </w:r>
-      <w:r>
-        <w:t>3</w:t>
-      </w:r>
-      <w:r>
-        <w:t>) each such person consents to the personal jurisdiction of the courts of Maricopa County, Arizona.</w:t>
-      </w:r>
-      <w:r>
-        <w:rPr>
-          <w:rStyle w:val="CLALTRHiddenTextChar"/>
-        </w:rPr>
+        <w:t xml:space="preserve"> provide services that </w:t>
+      </w:r>
+      <w:r>
+        <w:t xml:space="preserve">the Client </w:t>
+      </w:r>
+      <w:r>
+        <w:t>ha</w:t>
+      </w:r>
+      <w:r>
+        <w:t>s</w:t>
+      </w:r>
+      <w:r>
+        <w:t xml:space="preserve"> requested from </w:t>
+      </w:r>
+      <w:r>
+        <w:t xml:space="preserve">ONYX </w:t>
+      </w:r>
+      <w:r>
+        <w:t xml:space="preserve">or from any such affiliated company. Any such affiliated company shall be subject to the same restrictions on the use and disclosure of </w:t>
+      </w:r>
+      <w:r>
+        <w:t xml:space="preserve">the Client’s </w:t>
+      </w:r>
+      <w:r>
+        <w:t xml:space="preserve">information as apply to </w:t>
+      </w:r>
+      <w:r>
+        <w:t>ONYX</w:t>
+      </w:r>
+      <w:r>
+        <w:t>.</w:t>
+      </w:r>
+    </w:p>
+    <w:p>
+      <w:pPr>
+        <w:pStyle w:val="CLALTRNormal"/>
+        <w:jc w:val="both"/>
+      </w:pPr>
+      <w:r>
+        <w:t xml:space="preserve">ONYX </w:t>
+      </w:r>
+      <w:r>
+        <w:t xml:space="preserve">will be responsible for </w:t>
+      </w:r>
+      <w:r>
+        <w:t xml:space="preserve">its </w:t>
+      </w:r>
+      <w:r>
+        <w:t xml:space="preserve">property and casualty, general liability, and workers compensation insurance, taxes, professional training, and other personnel costs related to the operation of </w:t>
+      </w:r>
+      <w:r>
+        <w:t xml:space="preserve">its </w:t>
+      </w:r>
+      <w:r>
+        <w:t xml:space="preserve">business. </w:t>
+      </w:r>
+    </w:p>
+    <w:p>
+      <w:pPr>
+        <w:pStyle w:val="CLALTRNormal"/>
+        <w:jc w:val="both"/>
+      </w:pPr>
+      <w:r>
+        <w:t xml:space="preserve">When performing the services above, </w:t>
+      </w:r>
+      <w:r>
+        <w:t xml:space="preserve">ONYX </w:t>
+      </w:r>
+      <w:r>
+        <w:t xml:space="preserve">will utilize the resources available </w:t>
+      </w:r>
+      <w:r>
+        <w:t xml:space="preserve">from </w:t>
+      </w:r>
+      <w:r>
+        <w:t xml:space="preserve">the </w:t>
+      </w:r>
+      <w:r>
+        <w:t xml:space="preserve">Client </w:t>
+      </w:r>
+      <w:r>
+        <w:t xml:space="preserve">to the extent practical to continue development of </w:t>
+      </w:r>
+      <w:r>
+        <w:t xml:space="preserve">the Client’s </w:t>
+      </w:r>
+      <w:r>
+        <w:t xml:space="preserve">personnel. During a portion of </w:t>
+      </w:r>
+      <w:r>
+        <w:t xml:space="preserve">ONYX’s </w:t>
+      </w:r>
+      <w:r>
+        <w:t xml:space="preserve">work, </w:t>
+      </w:r>
+      <w:r>
+        <w:t xml:space="preserve">ONYX </w:t>
+      </w:r>
+      <w:r>
+        <w:t xml:space="preserve">may require the use of </w:t>
+      </w:r>
+      <w:r>
+        <w:t xml:space="preserve">the Client’s </w:t>
+      </w:r>
+      <w:r>
+        <w:t xml:space="preserve">computers. </w:t>
+      </w:r>
+      <w:r>
+        <w:t xml:space="preserve">ONYX </w:t>
+      </w:r>
+      <w:r>
+        <w:t>will try</w:t>
+      </w:r>
+      <w:r>
+        <w:t>, but does not guarantee,</w:t>
+      </w:r>
+      <w:r>
+        <w:t xml:space="preserve"> to give </w:t>
+      </w:r>
+      <w:r>
+        <w:t xml:space="preserve">the Client </w:t>
+      </w:r>
+      <w:r>
+        <w:t xml:space="preserve">advance notice and coordinate </w:t>
+      </w:r>
+      <w:r>
+        <w:t xml:space="preserve">its </w:t>
+      </w:r>
+      <w:r>
+        <w:t xml:space="preserve">use so it does not interfere with </w:t>
+      </w:r>
+      <w:r>
+        <w:t xml:space="preserve">the Client’s </w:t>
+      </w:r>
+      <w:r>
+        <w:t>employees.</w:t>
+      </w:r>
+    </w:p>
+    <w:p>
+      <w:pPr>
+        <w:pStyle w:val="CLALTRNormal"/>
+        <w:jc w:val="both"/>
+      </w:pPr>
+      <w:r>
+        <w:t xml:space="preserve">The relationship of </w:t>
+      </w:r>
+      <w:r>
+        <w:t>ONYX</w:t>
+      </w:r>
+      <w:r>
         <w:t xml:space="preserve"> </w:t>
       </w:r>
       <w:r>
-        <w:rPr>
-          <w:rStyle w:val="CLALTRHiddenTextChar"/>
-        </w:rPr>
-        <w:t xml:space="preserve">  </w:t>
-      </w:r>
-    </w:p>
-    <w:p>
-      <w:pPr>
-        <w:pStyle w:val="CLALTRNormal"/>
-        <w:jc w:val="both"/>
-      </w:pPr>
-      <w:r>
-        <w:t xml:space="preserve">The Client further agrees that it will not hold ONYX or any other ONYX Party liable for any claim, cost, or damage, whether based on warranty, tort, contract, or other law, arising from or related to this agreement, the services provided under this agreement, the work product, or for any plans, actions, or results of this engagement, except to the extent authorized by this agreement.</w:t>
-      </w:r>
-    </w:p>
-    <w:p>
-      <w:pPr>
-        <w:pStyle w:val="CLALTRNormal"/>
-        <w:jc w:val="both"/>
-      </w:pPr>
-      <w:r>
-        <w:t xml:space="preserve">To the fullest extent permitted by law, the aggregate liability of all ONYX Parties arising out of or relating to this agreement, the services provided under this agreement, or any work product delivered pursuant to this agreement, regardless of the form of action and whether based in contract, tort, negligence, strict liability, statute, fiduciary theory, or otherwise, shall not exceed the total fees actually paid by Client to ONYX under this agreement during the twelve (12) months immediately preceding the event giving rise to the claim.</w:t>
-      </w:r>
-    </w:p>
-    <w:p>
-      <w:pPr>
-        <w:pStyle w:val="CLALTRNormal"/>
-        <w:jc w:val="both"/>
-      </w:pPr>
-      <w:r>
-        <w:t xml:space="preserve">In no event shall any ONYX Party be liable for any indirect, consequential, special, incidental, exemplary, enhanced, or punitive damages, including without limitation loss of profits, loss of revenue, loss of business opportunity, loss of anticipated savings, loss of data, loss of goodwill, business interruption losses, or attorneys’ fees and costs, regardless of the legal theory asserted and even if advised of the possibility of such damages.</w:t>
-      </w:r>
-    </w:p>
-    <w:p>
-      <w:pPr>
-        <w:pStyle w:val="CLALTRNormal"/>
-        <w:jc w:val="both"/>
-      </w:pPr>
-    </w:p>
-    <w:p>
-      <w:pPr>
-        <w:pStyle w:val="CLALTRNormal"/>
-        <w:jc w:val="both"/>
-      </w:pPr>
-    </w:p>
-    <w:p>
-      <w:pPr>
-        <w:pStyle w:val="CLALTRHeading1"/>
-        <w:jc w:val="both"/>
-      </w:pPr>
+        <w:t>with the Client</w:t>
+      </w:r>
+      <w:r>
+        <w:t xml:space="preserve"> shall be solely that of an independent contractor</w:t>
+      </w:r>
+      <w:r>
+        <w:t>,</w:t>
+      </w:r>
+      <w:r>
+        <w:t xml:space="preserve"> and nothing in this agreement shall be construed to create or imply any relationship of employment, agency, partnership, or any relationship other than</w:t>
+      </w:r>
+      <w:r>
+        <w:t xml:space="preserve"> that of</w:t>
+      </w:r>
+      <w:r>
+        <w:t xml:space="preserve"> an independent contractor.</w:t>
+      </w:r>
+    </w:p>
+    <w:p>
+      <w:pPr>
+        <w:pStyle w:val="CLALTRNormal"/>
+        <w:jc w:val="both"/>
+      </w:pPr>
+      <w:r>
+        <w:t xml:space="preserve">Accounting standards and procedures will be suggested that are consistent with those normally utilized in an entity of the Client’s size and nature. ONYX will require the Client to approve any changes in the application of accounting standards and procedures for the Client. Internal controls may be recommended relating to the </w:t>
+      </w:r>
       <w:r>
         <w:lastRenderedPageBreak/>
-        <w:t>Time limitation</w:t>
-      </w:r>
-    </w:p>
-    <w:p>
-      <w:pPr>
-        <w:pStyle w:val="CLALTRNormal"/>
-        <w:jc w:val="both"/>
-      </w:pPr>
-      <w:r>
-        <w:t xml:space="preserve">The nature of our services makes it difficult, with the passage of time, to gather and present evidence that fully and fairly establishes the facts underlying any dispute that may arise between </w:t>
-      </w:r>
-      <w:r>
-        <w:t xml:space="preserve">the Client </w:t>
-      </w:r>
-      <w:r>
-        <w:t xml:space="preserve">and any </w:t>
+        <w:t>safeguarding of the Client’s assets. If fraud is initiated by the Client’s employees or other service providers, any resulting losses shall be the Client’s responsibility, and the Client shall look first to its own insurance coverage.</w:t>
+      </w:r>
+    </w:p>
+    <w:p>
+      <w:pPr>
+        <w:pStyle w:val="CLALTRNormal"/>
+        <w:jc w:val="both"/>
+      </w:pPr>
+      <w:r>
+        <w:t xml:space="preserve">The </w:t>
+      </w:r>
+      <w:r>
+        <w:t xml:space="preserve">Client </w:t>
+      </w:r>
+      <w:r>
+        <w:t xml:space="preserve">agrees that </w:t>
       </w:r>
       <w:r>
         <w:t>ONYX</w:t>
       </w:r>
       <w:r>
-        <w:t xml:space="preserve"> </w:t>
-      </w:r>
-      <w:r>
-        <w:t>P</w:t>
-      </w:r>
-      <w:r>
-        <w:t xml:space="preserve">arty. The </w:t>
-      </w:r>
-      <w:r>
-        <w:t>Client and ONYX</w:t>
-      </w:r>
-      <w:r>
-        <w:t xml:space="preserve"> agree that, notwithstanding any statute or law of limitations that might otherwise apply to a dispute, including one arising out of this agreement or the services performed under this agreement, for breach of contract or fiduciary duty, tort, fraud, misrepresentation or any other cause of action or remedy, any action or legal proceeding by </w:t>
-      </w:r>
-      <w:r>
-        <w:t xml:space="preserve">the Client </w:t>
-      </w:r>
-      <w:r>
-        <w:t xml:space="preserve">against any </w:t>
-      </w:r>
-      <w:r>
-        <w:t>ONYX</w:t>
-      </w:r>
-      <w:r>
-        <w:t xml:space="preserve"> </w:t>
-      </w:r>
-      <w:r>
-        <w:t>P</w:t>
-      </w:r>
-      <w:r>
-        <w:t xml:space="preserve">arty must be commenced separately </w:t>
-      </w:r>
-      <w:r>
-        <w:t xml:space="preserve">within twenty-four (24) </w:t>
-      </w:r>
-      <w:r>
-        <w:t xml:space="preserve">months after the date when </w:t>
-      </w:r>
-      <w:r>
-        <w:t xml:space="preserve">ONYX </w:t>
-      </w:r>
-      <w:r>
-        <w:t>deliver</w:t>
-      </w:r>
-      <w:r>
-        <w:t>s</w:t>
-      </w:r>
-      <w:r>
-        <w:t xml:space="preserve"> such services under this agreement to </w:t>
-      </w:r>
-      <w:r>
-        <w:t xml:space="preserve">the Client </w:t>
-      </w:r>
-      <w:r>
-        <w:t>on which the dispute is based</w:t>
-      </w:r>
-      <w:r>
-        <w:t xml:space="preserve"> (the “Limitation Period”)</w:t>
-      </w:r>
-      <w:r>
-        <w:t xml:space="preserve">, regardless of whether any </w:t>
-      </w:r>
-      <w:r>
-        <w:t>ONYX</w:t>
-      </w:r>
-      <w:r>
-        <w:t xml:space="preserve"> </w:t>
-      </w:r>
-      <w:r>
-        <w:t>P</w:t>
-      </w:r>
-      <w:r>
-        <w:t xml:space="preserve">arty provides other services for </w:t>
-      </w:r>
-      <w:r>
-        <w:t xml:space="preserve">the Client </w:t>
-      </w:r>
-      <w:r>
-        <w:t xml:space="preserve">under this agreement, or </w:t>
-      </w:r>
-      <w:r>
-        <w:t xml:space="preserve">the Client </w:t>
-      </w:r>
-      <w:r>
-        <w:t>shall be forever barred from commencing a lawsuit or obtaining any legal or equitable relief or recovery</w:t>
-      </w:r>
-      <w:r>
-        <w:t xml:space="preserve"> against any ONYX Party</w:t>
-      </w:r>
-      <w:r>
-        <w:t>.</w:t>
-      </w:r>
-      <w:r>
-        <w:t xml:space="preserve"> </w:t>
-      </w:r>
-    </w:p>
-    <w:p>
-      <w:pPr>
-        <w:pStyle w:val="CLALTRNormal"/>
-        <w:jc w:val="both"/>
-      </w:pPr>
-      <w:r>
-        <w:t xml:space="preserve">The Limitation Period applies and begins to run even if </w:t>
-      </w:r>
-      <w:r>
-        <w:t xml:space="preserve">the Client </w:t>
-      </w:r>
-      <w:r>
-        <w:t>ha</w:t>
-      </w:r>
-      <w:r>
-        <w:t>s</w:t>
-      </w:r>
-      <w:r>
-        <w:t xml:space="preserve"> not suffered any damage or loss or ha</w:t>
-      </w:r>
-      <w:r>
-        <w:t>s</w:t>
-      </w:r>
-      <w:r>
-        <w:t xml:space="preserve"> not become aware of the existence or possible existence of a dispute.</w:t>
-      </w:r>
-    </w:p>
-    <w:p>
-      <w:pPr>
-        <w:pStyle w:val="CLALTRHeading1"/>
-        <w:jc w:val="both"/>
-      </w:pPr>
-      <w:r>
-        <w:t>Other provisions</w:t>
-      </w:r>
-    </w:p>
-    <w:p>
-      <w:pPr>
-        <w:pStyle w:val="CLALTRNormal"/>
-        <w:jc w:val="both"/>
-      </w:pPr>
-      <w:r>
-        <w:t>Except as permitted by the “Consent” section of this agreement,</w:t>
-      </w:r>
-      <w:r>
-        <w:t xml:space="preserve"> </w:t>
-      </w:r>
-      <w:r>
-        <w:t>ONYX</w:t>
-      </w:r>
-      <w:r>
-        <w:t xml:space="preserve"> will not disclose any confidential, proprietary, or privileged information of the entity to any persons without the </w:t>
-      </w:r>
-      <w:r>
-        <w:t xml:space="preserve">Client’s </w:t>
-      </w:r>
-      <w:r>
-        <w:t>authorization or unless required by law.</w:t>
-      </w:r>
-      <w:r>
-        <w:t xml:space="preserve"> </w:t>
-      </w:r>
-      <w:r>
-        <w:t xml:space="preserve">This confidentiality provision does not prohibit </w:t>
-      </w:r>
-      <w:r>
-        <w:t xml:space="preserve">ONYX </w:t>
-      </w:r>
-      <w:r>
-        <w:t xml:space="preserve">from disclosing </w:t>
+        <w:t xml:space="preserve"> will not be assuming any fiduciary responsibility on </w:t>
       </w:r>
       <w:r>
         <w:t xml:space="preserve">the Client’s </w:t>
       </w:r>
       <w:r>
-        <w:t xml:space="preserve">information to one or more of our affiliated companies </w:t>
+        <w:t xml:space="preserve">behalf </w:t>
       </w:r>
       <w:proofErr w:type="gramStart"/>
       <w:r>
-        <w:t>in order to</w:t>
+        <w:t>during the course of</w:t>
       </w:r>
       <w:proofErr w:type="gramEnd"/>
       <w:r>
-        <w:t xml:space="preserve"> provide services that </w:t>
-      </w:r>
-      <w:r>
-        <w:t xml:space="preserve">the Client </w:t>
-      </w:r>
-      <w:r>
-        <w:t>ha</w:t>
-      </w:r>
-      <w:r>
-        <w:t>s</w:t>
-      </w:r>
-      <w:r>
-        <w:t xml:space="preserve"> requested from </w:t>
-      </w:r>
-      <w:r>
-        <w:t xml:space="preserve">ONYX </w:t>
-      </w:r>
-      <w:r>
-        <w:t xml:space="preserve">or from any such affiliated company. Any such affiliated company shall be subject to the same restrictions on the use and disclosure of </w:t>
-      </w:r>
-      <w:r>
-        <w:t xml:space="preserve">the Client’s </w:t>
-      </w:r>
-      <w:r>
-        <w:t xml:space="preserve">information as apply to </w:t>
-      </w:r>
-      <w:r>
-        <w:t>ONYX</w:t>
-      </w:r>
-      <w:r>
-        <w:t>.</w:t>
-      </w:r>
-    </w:p>
-    <w:p>
-      <w:pPr>
-        <w:pStyle w:val="CLALTRNormal"/>
-        <w:jc w:val="both"/>
-      </w:pPr>
-      <w:r>
-        <w:t xml:space="preserve">ONYX </w:t>
-      </w:r>
-      <w:r>
-        <w:t xml:space="preserve">will be responsible for </w:t>
-      </w:r>
-      <w:r>
-        <w:t xml:space="preserve">its </w:t>
-      </w:r>
-      <w:r>
-        <w:t xml:space="preserve">property and casualty, general liability, and workers compensation insurance, taxes, professional training, and other personnel costs related to the operation of </w:t>
-      </w:r>
-      <w:r>
-        <w:t xml:space="preserve">its </w:t>
-      </w:r>
-      <w:r>
-        <w:t xml:space="preserve">business. </w:t>
-      </w:r>
-    </w:p>
-    <w:p>
-      <w:pPr>
-        <w:pStyle w:val="CLALTRNormal"/>
-        <w:jc w:val="both"/>
-      </w:pPr>
-      <w:r>
-        <w:t xml:space="preserve">When performing the services above, </w:t>
-      </w:r>
-      <w:r>
-        <w:t xml:space="preserve">ONYX </w:t>
-      </w:r>
-      <w:r>
-        <w:t xml:space="preserve">will utilize the resources available </w:t>
-      </w:r>
-      <w:r>
-        <w:t xml:space="preserve">from </w:t>
-      </w:r>
-      <w:r>
-        <w:t xml:space="preserve">the </w:t>
-      </w:r>
-      <w:r>
-        <w:t xml:space="preserve">Client </w:t>
-      </w:r>
-      <w:r>
-        <w:t xml:space="preserve">to the extent practical to continue development of </w:t>
-      </w:r>
-      <w:r>
-        <w:t xml:space="preserve">the Client’s </w:t>
-      </w:r>
-      <w:r>
-        <w:t xml:space="preserve">personnel. During a portion of </w:t>
-      </w:r>
-      <w:r>
-        <w:t xml:space="preserve">ONYX’s </w:t>
-      </w:r>
-      <w:r>
-        <w:t xml:space="preserve">work, </w:t>
-      </w:r>
-      <w:r>
-        <w:t xml:space="preserve">ONYX </w:t>
-      </w:r>
-      <w:r>
-        <w:t xml:space="preserve">may require the use of </w:t>
-      </w:r>
-      <w:r>
-        <w:t xml:space="preserve">the Client’s </w:t>
-      </w:r>
-      <w:r>
-        <w:t xml:space="preserve">computers. </w:t>
-      </w:r>
-      <w:r>
-        <w:t xml:space="preserve">ONYX </w:t>
-      </w:r>
-      <w:r>
-        <w:t>will try</w:t>
-      </w:r>
-      <w:r>
-        <w:t>, but does not guarantee,</w:t>
-      </w:r>
-      <w:r>
-        <w:t xml:space="preserve"> to give </w:t>
-      </w:r>
-      <w:r>
-        <w:t xml:space="preserve">the Client </w:t>
-      </w:r>
-      <w:r>
-        <w:t xml:space="preserve">advance notice and coordinate </w:t>
-      </w:r>
-      <w:r>
-        <w:t xml:space="preserve">its </w:t>
-      </w:r>
-      <w:r>
-        <w:t xml:space="preserve">use so it does not interfere with </w:t>
-      </w:r>
-      <w:r>
-        <w:t xml:space="preserve">the Client’s </w:t>
-      </w:r>
-      <w:r>
-        <w:t>employees.</w:t>
-      </w:r>
-    </w:p>
-    <w:p>
-      <w:pPr>
-        <w:pStyle w:val="CLALTRNormal"/>
-        <w:jc w:val="both"/>
-      </w:pPr>
-      <w:r>
-        <w:lastRenderedPageBreak/>
-        <w:t xml:space="preserve">The relationship of </w:t>
-      </w:r>
-      <w:r>
-        <w:t>ONYX</w:t>
-      </w:r>
-      <w:r>
-        <w:t xml:space="preserve"> </w:t>
-      </w:r>
-      <w:r>
-        <w:t>with the Client</w:t>
-      </w:r>
-      <w:r>
-        <w:t xml:space="preserve"> shall be solely that of an independent contractor</w:t>
-      </w:r>
-      <w:r>
-        <w:t>,</w:t>
-      </w:r>
-      <w:r>
-        <w:t xml:space="preserve"> and nothing in this agreement shall be construed to create or imply any relationship of employment, agency, partnership, or any relationship other than</w:t>
-      </w:r>
-      <w:r>
-        <w:t xml:space="preserve"> that of</w:t>
-      </w:r>
-      <w:r>
-        <w:t xml:space="preserve"> an independent contractor.</w:t>
-      </w:r>
-    </w:p>
-    <w:p>
-      <w:pPr>
-        <w:pStyle w:val="CLALTRNormal"/>
-        <w:jc w:val="both"/>
-      </w:pPr>
-      <w:r>
-        <w:t xml:space="preserve">Accounting standards and procedures will be suggested that are consistent with those normally utilized in an entity of the Client’s size and nature. ONYX will require the Client to approve any changes in the application of accounting standards and procedures for the Client. Internal controls may be recommended relating to the safeguarding of the Client’s assets. If fraud is initiated by the Client’s employees or other service providers, any resulting losses shall be the Client’s responsibility, and the Client shall look first to its own insurance coverage.</w:t>
-      </w:r>
-    </w:p>
-    <w:p>
-      <w:pPr>
-        <w:pStyle w:val="CLALTRNormal"/>
-        <w:jc w:val="both"/>
-      </w:pPr>
-      <w:r>
-        <w:t xml:space="preserve">The </w:t>
-      </w:r>
-      <w:r>
-        <w:t xml:space="preserve">Client </w:t>
-      </w:r>
-      <w:r>
-        <w:t xml:space="preserve">agrees that </w:t>
-      </w:r>
-      <w:r>
-        <w:t>ONYX</w:t>
-      </w:r>
-      <w:r>
-        <w:t xml:space="preserve"> will not be assuming any fiduciary responsibility on </w:t>
-      </w:r>
-      <w:r>
-        <w:t xml:space="preserve">the Client’s </w:t>
-      </w:r>
-      <w:r>
-        <w:t xml:space="preserve">behalf </w:t>
-      </w:r>
-      <w:proofErr w:type="gramStart"/>
-      <w:r>
-        <w:t>during the course of</w:t>
-      </w:r>
-      <w:proofErr w:type="gramEnd"/>
-      <w:r>
         <w:t xml:space="preserve"> this engagement.</w:t>
       </w:r>
     </w:p>
@@ -3502,7 +3080,7 @@
         <w:t xml:space="preserve">Record retention.  </w:t>
       </w:r>
       <w:r>
-        <w:t xml:space="preserve">ONYX will retain its working papers, supporting schedules, and other documentation prepared in connection with this engagement for a period of seven (7) years from the completion of the applicable services, after which ONYX may destroy or otherwise dispose of such records without further notice to the Client. Working papers and other documents prepared by ONYX in the course of the engagement remain the property of ONYX. Original records, source documents, and other materials furnished by the Client remain the property of the Client and will be returned upon written request. The Client is responsible for maintaining its own copies of its records and for meeting its own record-retention obligations. ONYX has no obligation to retain any records or data beyond the seven (7) year period and may maintain such records in electronic form.</w:t>
+        <w:t>ONYX will retain its working papers, supporting schedules, and other documentation prepared in connection with this engagement for a period of seven (7) years from the completion of the applicable services, after which ONYX may destroy or otherwise dispose of such records without further notice to the Client. Working papers and other documents prepared by ONYX in the course of the engagement remain the property of ONYX. Original records, source documents, and other materials furnished by the Client remain the property of the Client and will be returned upon written request. The Client is responsible for maintaining its own copies of its records and for meeting its own record-retention obligations. ONYX has no obligation to retain any records or data beyond the seven (7) year period and may maintain such records in electronic form.</w:t>
       </w:r>
     </w:p>
     <w:p>
@@ -3609,85 +3187,261 @@
         <w:t xml:space="preserve">will be required to pay an employment fee of </w:t>
       </w:r>
       <w:r>
+        <w:t>$200,000 for the CFO, $150,000 for the controller, and $100,000 for the staff</w:t>
+      </w:r>
+      <w:r>
+        <w:t xml:space="preserve"> to </w:t>
+      </w:r>
+      <w:r>
+        <w:t>ONYX</w:t>
+      </w:r>
+      <w:r>
+        <w:t xml:space="preserve"> immediately upon receipt of this notice.</w:t>
+      </w:r>
+    </w:p>
+    <w:p>
+      <w:pPr>
+        <w:pStyle w:val="CLALTRNormal"/>
+        <w:jc w:val="both"/>
+      </w:pPr>
+      <w:r>
+        <w:lastRenderedPageBreak/>
+        <w:t xml:space="preserve">If any former </w:t>
+      </w:r>
+      <w:r>
+        <w:t>ONYX</w:t>
+      </w:r>
+      <w:r>
+        <w:t xml:space="preserve"> employee shall be hired as an employee</w:t>
+      </w:r>
+      <w:r>
+        <w:t xml:space="preserve"> of the Client</w:t>
+      </w:r>
+      <w:r>
+        <w:t xml:space="preserve"> within</w:t>
+      </w:r>
+      <w:r>
+        <w:t xml:space="preserve"> ninety</w:t>
+      </w:r>
+      <w:r>
+        <w:t xml:space="preserve"> </w:t>
+      </w:r>
+      <w:r>
+        <w:t>(</w:t>
+      </w:r>
+      <w:r>
+        <w:t>90</w:t>
+      </w:r>
+      <w:r>
+        <w:t>)</w:t>
+      </w:r>
+      <w:r>
+        <w:t xml:space="preserve"> days of leaving </w:t>
+      </w:r>
+      <w:r>
+        <w:t>ONYX</w:t>
+      </w:r>
+      <w:r>
+        <w:t xml:space="preserve">, there shall be a rebuttable presumption that the </w:t>
+      </w:r>
+      <w:r>
+        <w:t>ONYX</w:t>
+      </w:r>
+      <w:r>
+        <w:t xml:space="preserve"> employee was solicited to work as an employee of the </w:t>
+      </w:r>
+      <w:r>
+        <w:t xml:space="preserve">Client, </w:t>
+      </w:r>
+      <w:r>
+        <w:t xml:space="preserve">and the above fee shall be payable to </w:t>
+      </w:r>
+      <w:r>
+        <w:t>ONYX</w:t>
+      </w:r>
+      <w:r>
+        <w:t xml:space="preserve"> from the Client</w:t>
+      </w:r>
+      <w:r>
+        <w:t>.</w:t>
+      </w:r>
+    </w:p>
+    <w:p>
+      <w:pPr>
+        <w:pStyle w:val="CLALTRHeading1"/>
+        <w:jc w:val="both"/>
+      </w:pPr>
+      <w:r>
+        <w:t>Consent</w:t>
+      </w:r>
+    </w:p>
+    <w:p>
+      <w:pPr>
+        <w:pStyle w:val="CLALTRHeading2"/>
+        <w:jc w:val="both"/>
         <w:rPr/>
-        <w:t>$200,000 for the CFO, $150,000 for the controller, and $100,000 for the staff</w:t>
+      </w:pPr>
+      <w:r>
+        <w:t>Subcontractors</w:t>
+      </w:r>
+      <w:r>
+        <w:rPr>
+          <w:rStyle w:val="CLALTRHiddenTextChar"/>
+        </w:rPr>
+        <w:t xml:space="preserve">    </w:t>
+      </w:r>
+    </w:p>
+    <w:p>
+      <w:pPr>
+        <w:pStyle w:val="CLALTRNormal"/>
+        <w:jc w:val="both"/>
+      </w:pPr>
+      <w:r>
+        <w:t>ONYX</w:t>
+      </w:r>
+      <w:r>
+        <w:t xml:space="preserve"> may, at times, use subcontractors to perform services under this agreement, and </w:t>
+      </w:r>
+      <w:r>
+        <w:t>said subcontractors</w:t>
+      </w:r>
+      <w:r>
+        <w:t xml:space="preserve"> </w:t>
+      </w:r>
+      <w:r>
+        <w:t xml:space="preserve">may have access to </w:t>
+      </w:r>
+      <w:r>
+        <w:t>the Client’s</w:t>
+      </w:r>
+      <w:r>
+        <w:t xml:space="preserve"> </w:t>
+      </w:r>
+      <w:r>
+        <w:t xml:space="preserve">information and records. Any such subcontractors will be subject to the same restrictions on the use of such information and records as apply to </w:t>
+      </w:r>
+      <w:r>
+        <w:t>ONYX</w:t>
+      </w:r>
+      <w:r>
+        <w:t xml:space="preserve"> under this agreement.</w:t>
+      </w:r>
+    </w:p>
+    <w:p>
+      <w:pPr>
+        <w:pStyle w:val="CLALTRHeading2"/>
+        <w:jc w:val="both"/>
+      </w:pPr>
+      <w:r>
+        <w:t>Technology</w:t>
+      </w:r>
+    </w:p>
+    <w:p>
+      <w:pPr>
+        <w:pStyle w:val="CLALTRNormal"/>
+        <w:jc w:val="both"/>
+      </w:pPr>
+      <w:r>
+        <w:t>ONYX may use third-party software, cloud-based platforms, and advanced technologies, including automated data processing and artificial intelligence tools, to assist in delivering services under this agreement. The Client acknowledges and authorizes ONYX to share and process the Client’s data with such providers as necessary to perform the services. These providers may have access to the Client’s data solely for the purpose of supporting ONYX’s service delivery. ONYX uses commercially reasonable efforts to select and maintain service providers with appropriate data security and confidentiality standards.</w:t>
+      </w:r>
+    </w:p>
+    <w:p>
+      <w:pPr>
+        <w:pStyle w:val="CLALTRNormal"/>
+        <w:jc w:val="both"/>
+      </w:pPr>
+      <w:r>
+        <w:t>The Client authorizes ONYX to sign on the Client’s behalf any vendor agreements applicable to such software applications, and ONYX shall provide a copy of the application agreement at the Client’s request.</w:t>
+      </w:r>
+    </w:p>
+    <w:p>
+      <w:pPr>
+        <w:pStyle w:val="CLALTRNormal"/>
+        <w:jc w:val="both"/>
+      </w:pPr>
+      <w:r>
+        <w:t>Client acknowledges that ONYX may access Client’s accounting systems, banking platforms, payroll systems, software applications, cloud-based services, and other technology systems as reasonably necessary to perform the services described in this agreement. Client shall remain solely responsible for maintaining the security of its systems, credentials, access permissions, authentication controls, network infrastructure, and data.</w:t>
+      </w:r>
+    </w:p>
+    <w:p>
+      <w:pPr>
+        <w:pStyle w:val="CLALTRNormal"/>
+        <w:jc w:val="both"/>
+      </w:pPr>
+      <w:r>
+        <w:t>Client acknowledges that cyber incidents, phishing attacks, social engineering events, credential compromise, malware, ransomware, unauthorized access, and failures of third-party technology providers may occur despite reasonable safeguards. Except to the extent resulting from ONYX’s gross negligence or willful misconduct, ONYX shall not be responsible for any loss, theft, alteration, corruption, disclosure, or unauthorized access to Client data, funds, systems, or information arising from such events.</w:t>
+      </w:r>
+    </w:p>
+    <w:p>
+      <w:pPr>
+        <w:pStyle w:val="CLALTRNormal"/>
+        <w:jc w:val="both"/>
+      </w:pPr>
+      <w:r>
+        <w:t>Client further acknowledges that ONYX may rely upon electronic communications, system credentials, approvals, instructions, and authorizations reasonably believed by ONYX to have originated from authorized Client representatives, and ONYX shall have no liability for actions taken in reasonable reliance upon such communications or instructions.</w:t>
+      </w:r>
+    </w:p>
+    <w:p>
+      <w:pPr>
+        <w:pStyle w:val="CLALTRHeading1"/>
+        <w:jc w:val="both"/>
+      </w:pPr>
+      <w:r>
+        <w:t>Agreement</w:t>
+      </w:r>
+    </w:p>
+    <w:p>
+      <w:pPr>
+        <w:pStyle w:val="CLALTRNormal"/>
+        <w:jc w:val="both"/>
+      </w:pPr>
+      <w:r>
+        <w:t xml:space="preserve">We appreciate the opportunity to be of service to </w:t>
+      </w:r>
+      <w:r>
+        <w:t xml:space="preserve">the Client </w:t>
+      </w:r>
+      <w:r>
+        <w:t xml:space="preserve">and believe this letter accurately summarizes the significant terms of </w:t>
+      </w:r>
+      <w:r>
+        <w:t xml:space="preserve">ONYX’s </w:t>
+      </w:r>
+      <w:r>
+        <w:t xml:space="preserve">engagement. This letter constitutes the entire agreement regarding these services and supersedes all prior agreements (whether oral or written), understandings, negotiations, and discussions between </w:t>
+      </w:r>
+      <w:r>
+        <w:t xml:space="preserve">the Client </w:t>
+      </w:r>
+      <w:r>
+        <w:t xml:space="preserve">and </w:t>
+      </w:r>
+      <w:r>
+        <w:t>ONYX</w:t>
+      </w:r>
+      <w:r>
+        <w:t xml:space="preserve">. If you have any questions, please let us know. If you agree with the terms of </w:t>
+      </w:r>
+      <w:r>
+        <w:t xml:space="preserve">ONYX’s </w:t>
+      </w:r>
+      <w:r>
+        <w:t xml:space="preserve">engagement as described in this letter, please sign, date, and return </w:t>
+      </w:r>
+      <w:r>
+        <w:t xml:space="preserve">a </w:t>
+      </w:r>
+      <w:r>
+        <w:t>signed copy</w:t>
+      </w:r>
+      <w:r>
+        <w:t xml:space="preserve"> of this letter</w:t>
       </w:r>
       <w:r>
         <w:t xml:space="preserve"> to </w:t>
       </w:r>
       <w:r>
-        <w:t>ONYX</w:t>
-      </w:r>
-      <w:r>
-        <w:t xml:space="preserve"> immediately upon receipt of this notice.</w:t>
-      </w:r>
-    </w:p>
-    <w:p>
-      <w:pPr>
-        <w:pStyle w:val="CLALTRNormal"/>
-        <w:jc w:val="both"/>
-      </w:pPr>
-      <w:r>
-        <w:t xml:space="preserve">If any former </w:t>
-      </w:r>
-      <w:r>
-        <w:t>ONYX</w:t>
-      </w:r>
-      <w:r>
-        <w:t xml:space="preserve"> employee shall be hired as an employee</w:t>
-      </w:r>
-      <w:r>
-        <w:t xml:space="preserve"> of the </w:t>
-      </w:r>
-      <w:proofErr w:type="spellStart"/>
-      <w:r>
-        <w:t>Client</w:t>
-      </w:r>
-      <w:proofErr w:type="spellEnd"/>
-      <w:r>
-        <w:t xml:space="preserve"> within</w:t>
-      </w:r>
-      <w:r>
-        <w:t xml:space="preserve"> ninety</w:t>
-      </w:r>
-      <w:r>
-        <w:t xml:space="preserve"> </w:t>
-      </w:r>
-      <w:r>
-        <w:t>(</w:t>
-      </w:r>
-      <w:r>
-        <w:t>90</w:t>
-      </w:r>
-      <w:r>
-        <w:t>)</w:t>
-      </w:r>
-      <w:r>
-        <w:t xml:space="preserve"> days of leaving </w:t>
-      </w:r>
-      <w:r>
-        <w:t>ONYX</w:t>
-      </w:r>
-      <w:r>
-        <w:t xml:space="preserve">, there shall be a rebuttable presumption that the </w:t>
-      </w:r>
-      <w:r>
-        <w:t>ONYX</w:t>
-      </w:r>
-      <w:r>
-        <w:t xml:space="preserve"> employee was solicited to work as an employee of the </w:t>
-      </w:r>
-      <w:r>
-        <w:t xml:space="preserve">Client, </w:t>
-      </w:r>
-      <w:r>
-        <w:t xml:space="preserve">and the above fee shall be payable to </w:t>
-      </w:r>
-      <w:r>
-        <w:t>ONYX</w:t>
-      </w:r>
-      <w:r>
-        <w:t xml:space="preserve"> from the Client</w:t>
+        <w:t>our office</w:t>
       </w:r>
       <w:r>
         <w:t>.</w:t>
@@ -3695,204 +3449,10 @@
     </w:p>
     <w:p>
       <w:pPr>
-        <w:pStyle w:val="CLALTRHeading1"/>
-        <w:jc w:val="both"/>
+        <w:pStyle w:val="CLALTRNormal"/>
       </w:pPr>
       <w:r>
         <w:lastRenderedPageBreak/>
-        <w:t>Consent</w:t>
-      </w:r>
-    </w:p>
-    <w:p>
-      <w:pPr>
-        <w:pStyle w:val="CLALTRHeading2"/>
-        <w:jc w:val="both"/>
-        <w:rPr>
-          <w:highlight w:val="yellow"/>
-        </w:rPr>
-      </w:pPr>
-      <w:r>
-        <w:rPr/>
-        <w:t>Subcontractors</w:t>
-      </w:r>
-      <w:r>
-        <w:rPr>
-          <w:rStyle w:val="CLALTRHiddenTextChar"/>
-        </w:rPr>
-        <w:t xml:space="preserve">    </w:t>
-      </w:r>
-    </w:p>
-    <w:p>
-      <w:pPr>
-        <w:pStyle w:val="CLALTRNormal"/>
-        <w:jc w:val="both"/>
-      </w:pPr>
-      <w:r>
-        <w:rPr/>
-        <w:t>ONYX</w:t>
-      </w:r>
-      <w:r>
-        <w:rPr/>
-        <w:t xml:space="preserve"> may, at times, use subcontractors to perform services under this agreement, and </w:t>
-      </w:r>
-      <w:r>
-        <w:rPr/>
-        <w:t>said subcontractors</w:t>
-      </w:r>
-      <w:r>
-        <w:rPr/>
-        <w:t xml:space="preserve"> </w:t>
-      </w:r>
-      <w:r>
-        <w:rPr/>
-        <w:t xml:space="preserve">may have access to </w:t>
-      </w:r>
-      <w:r>
-        <w:rPr/>
-        <w:t>the Client’s</w:t>
-      </w:r>
-      <w:r>
-        <w:rPr/>
-        <w:t xml:space="preserve"> </w:t>
-      </w:r>
-      <w:r>
-        <w:rPr/>
-        <w:t xml:space="preserve">information and records. Any such subcontractors will be subject to the same restrictions on the use of such information and records as apply to </w:t>
-      </w:r>
-      <w:r>
-        <w:rPr/>
-        <w:t>ONYX</w:t>
-      </w:r>
-      <w:r>
-        <w:rPr/>
-        <w:t xml:space="preserve"> under this agreement.</w:t>
-      </w:r>
-    </w:p>
-    <w:p>
-      <w:pPr>
-        <w:pStyle w:val="CLALTRHeading2"/>
-        <w:jc w:val="both"/>
-      </w:pPr>
-      <w:r>
-        <w:t>Technology</w:t>
-      </w:r>
-    </w:p>
-    <w:p>
-      <w:pPr>
-        <w:pStyle w:val="CLALTRNormal"/>
-        <w:jc w:val="both"/>
-      </w:pPr>
-      <w:r>
-        <w:t xml:space="preserve">ONYX may use third-party software, cloud-based platforms, and advanced technologies, including automated data processing and artificial intelligence tools, to assist in delivering services under this agreement. The Client acknowledges and authorizes ONYX to share and process the Client’s data with such providers as necessary to perform the services. These providers may have access to the Client’s data solely for the purpose of supporting ONYX’s service delivery. ONYX uses commercially reasonable efforts to select and maintain service providers with appropriate data security and confidentiality standards.</w:t>
-      </w:r>
-    </w:p>
-    <w:p>
-      <w:pPr>
-        <w:pStyle w:val="CLALTRNormal"/>
-        <w:jc w:val="both"/>
-      </w:pPr>
-      <w:r>
-        <w:t xml:space="preserve">The Client authorizes ONYX to sign on the Client’s behalf any vendor agreements applicable to such software applications, and ONYX shall provide a copy of the application agreement at the Client’s request.</w:t>
-      </w:r>
-    </w:p>
-    <w:p>
-      <w:pPr>
-        <w:pStyle w:val="CLALTRNormal"/>
-        <w:jc w:val="both"/>
-      </w:pPr>
-      <w:r>
-        <w:t xml:space="preserve">Client acknowledges that ONYX may access Client’s accounting systems, banking platforms, payroll systems, software applications, cloud-based services, and other technology systems as reasonably necessary to perform the services described in this agreement. Client shall remain solely responsible for maintaining the security of its systems, credentials, access permissions, authentication controls, network infrastructure, and data.</w:t>
-      </w:r>
-    </w:p>
-    <w:p>
-      <w:pPr>
-        <w:pStyle w:val="CLALTRNormal"/>
-        <w:jc w:val="both"/>
-      </w:pPr>
-      <w:r>
-        <w:t xml:space="preserve">Client acknowledges that cyber incidents, phishing attacks, social engineering events, credential compromise, malware, ransomware, unauthorized access, and failures of third-party technology providers may occur despite reasonable safeguards. Except to the extent resulting from ONYX’s gross negligence or willful misconduct, ONYX shall not be responsible for any loss, theft, alteration, corruption, disclosure, or unauthorized access to Client data, funds, systems, or information arising from such events.</w:t>
-      </w:r>
-    </w:p>
-    <w:p>
-      <w:pPr>
-        <w:pStyle w:val="CLALTRNormal"/>
-        <w:jc w:val="both"/>
-      </w:pPr>
-      <w:r>
-        <w:t xml:space="preserve">Client further acknowledges that ONYX may rely upon electronic communications, system credentials, approvals, instructions, and authorizations reasonably believed by ONYX to have originated from authorized Client representatives, and ONYX shall have no liability for actions taken in reasonable reliance upon such communications or instructions.</w:t>
-      </w:r>
-    </w:p>
-    <w:p>
-      <w:pPr>
-        <w:pStyle w:val="CLALTRHeading1"/>
-        <w:jc w:val="both"/>
-      </w:pPr>
-      <w:r>
-        <w:t>Agreement</w:t>
-      </w:r>
-    </w:p>
-    <w:p>
-      <w:pPr>
-        <w:pStyle w:val="CLALTRNormal"/>
-        <w:jc w:val="both"/>
-      </w:pPr>
-      <w:r>
-        <w:t xml:space="preserve">We appreciate the opportunity to be of service to </w:t>
-      </w:r>
-      <w:r>
-        <w:t xml:space="preserve">the Client </w:t>
-      </w:r>
-      <w:r>
-        <w:t xml:space="preserve">and believe this letter accurately summarizes the significant terms of </w:t>
-      </w:r>
-      <w:r>
-        <w:t xml:space="preserve">ONYX’s </w:t>
-      </w:r>
-      <w:r>
-        <w:t xml:space="preserve">engagement. This letter constitutes the entire agreement regarding these services and supersedes all prior agreements (whether oral or written), understandings, negotiations, and discussions between </w:t>
-      </w:r>
-      <w:r>
-        <w:t xml:space="preserve">the Client </w:t>
-      </w:r>
-      <w:r>
-        <w:t xml:space="preserve">and </w:t>
-      </w:r>
-      <w:r>
-        <w:t>ONYX</w:t>
-      </w:r>
-      <w:r>
-        <w:t xml:space="preserve">. If you have any questions, please let us know. If you agree with the terms of </w:t>
-      </w:r>
-      <w:r>
-        <w:t xml:space="preserve">ONYX’s </w:t>
-      </w:r>
-      <w:r>
-        <w:t xml:space="preserve">engagement as described in this letter, please sign, date, and return </w:t>
-      </w:r>
-      <w:r>
-        <w:t xml:space="preserve">a </w:t>
-      </w:r>
-      <w:r>
-        <w:t>signed copy</w:t>
-      </w:r>
-      <w:r>
-        <w:t xml:space="preserve"> of this letter</w:t>
-      </w:r>
-      <w:r>
-        <w:t xml:space="preserve"> to </w:t>
-      </w:r>
-      <w:r>
-        <w:t>our office</w:t>
-      </w:r>
-      <w:r>
-        <w:t>.</w:t>
-      </w:r>
-    </w:p>
-    <w:p>
-      <w:pPr>
-        <w:pStyle w:val="CLALTRNormal"/>
-      </w:pPr>
-      <w:r>
         <w:t>Sincerely,</w:t>
       </w:r>
     </w:p>
@@ -4022,7 +3582,6 @@
         <w:pStyle w:val="CLALTRHeading1"/>
       </w:pPr>
       <w:r>
-        <w:lastRenderedPageBreak/>
         <w:t>Response:</w:t>
       </w:r>
     </w:p>
@@ -4034,31 +3593,10 @@
         <w:t xml:space="preserve">This letter correctly sets forth the understanding of </w:t>
       </w:r>
       <w:r>
-        <w:fldChar w:fldCharType="begin">
-          <w:ffData>
-            <w:name w:val="Text46"/>
-            <w:enabled/>
-            <w:calcOnExit w:val="0"/>
-            <w:textInput>
-              <w:default w:val="[Client Name]"/>
-            </w:textInput>
-          </w:ffData>
-        </w:fldChar>
-      </w:r>
-      <w:r>
-        <w:instrText xml:space="preserve"> FORMTEXT </w:instrText>
-      </w:r>
-      <w:r>
-        <w:fldChar w:fldCharType="separate"/>
-      </w:r>
-      <w:r>
         <w:rPr>
           <w:noProof/>
         </w:rPr>
         <w:t>Swysh Den Basketball Inc.</w:t>
-      </w:r>
-      <w:r>
-        <w:fldChar w:fldCharType="end"/>
       </w:r>
       <w:r>
         <w:t>.</w:t>
@@ -4381,6 +3919,26 @@
 
 <file path=word/footer3.xml><?xml version="1.0" encoding="utf-8"?>
 <w:ftr xmlns:wpc="http://schemas.microsoft.com/office/word/2010/wordprocessingCanvas" xmlns:cx="http://schemas.microsoft.com/office/drawing/2014/chartex" xmlns:cx1="http://schemas.microsoft.com/office/drawing/2015/9/8/chartex" xmlns:cx2="http://schemas.microsoft.com/office/drawing/2015/10/21/chartex" xmlns:cx3="http://schemas.microsoft.com/office/drawing/2016/5/9/chartex" xmlns:cx4="http://schemas.microsoft.com/office/drawing/2016/5/10/chartex" xmlns:cx5="http://schemas.microsoft.com/office/drawing/2016/5/11/chartex" xmlns:cx6="http://schemas.microsoft.com/office/drawing/2016/5/12/chartex" xmlns:cx7="http://schemas.microsoft.com/office/drawing/2016/5/13/chartex" xmlns:cx8="http://schemas.microsoft.com/office/drawing/2016/5/14/chartex" xmlns:mc="http://schemas.openxmlformats.org/markup-compatibility/2006" xmlns:aink="http://schemas.microsoft.com/office/drawing/2016/ink" xmlns:am3d="http://schemas.microsoft.com/office/drawing/2017/model3d" xmlns:o="urn:schemas-microsoft-com:office:office" xmlns:oel="http://schemas.microsoft.com/office/2019/extlst" xmlns:r="http://schemas.openxmlformats.org/officeDocument/2006/relationships" xmlns:m="http://schemas.openxmlformats.org/officeDocument/2006/math" xmlns:v="urn:schemas-microsoft-com:vml" xmlns:wp14="http://schemas.microsoft.com/office/word/2010/wordprocessingDrawing" xmlns:wp="http://schemas.openxmlformats.org/drawingml/2006/wordprocessingDrawing" xmlns:w10="urn:schemas-microsoft-com:office:word" xmlns:w="http://schemas.openxmlformats.org/wordprocessingml/2006/main" xmlns:w14="http://schemas.microsoft.com/office/word/2010/wordml" xmlns:w15="http://schemas.microsoft.com/office/word/2012/wordml" xmlns:w16cex="http://schemas.microsoft.com/office/word/2018/wordml/cex" xmlns:w16cid="http://schemas.microsoft.com/office/word/2016/wordml/cid" xmlns:w16="http://schemas.microsoft.com/office/word/2018/wordml" xmlns:w16du="http://schemas.microsoft.com/office/word/2023/wordml/word16du" xmlns:w16sdtdh="http://schemas.microsoft.com/office/word/2020/wordml/sdtdatahash" xmlns:w16sdtfl="http://schemas.microsoft.com/office/word/2024/wordml/sdtformatlock" xmlns:w16se="http://schemas.microsoft.com/office/word/2015/wordml/symex" xmlns:wpg="http://schemas.microsoft.com/office/word/2010/wordprocessingGroup" xmlns:wpi="http://schemas.microsoft.com/office/word/2010/wordprocessingInk" xmlns:wne="http://schemas.microsoft.com/office/word/2006/wordml" xmlns:wps="http://schemas.microsoft.com/office/word/2010/wordprocessingShape" mc:Ignorable="w14 w15 w16se w16cid w16 w16cex w16sdtdh w16sdtfl w16du wp14">
+  <w:p>
+    <w:pPr>
+      <w:pStyle w:val="Footer"/>
+    </w:pPr>
+  </w:p>
+</w:ftr>
+</file>
+
+<file path=word/footer4.xml><?xml version="1.0" encoding="utf-8"?>
+<w:ftr xmlns:m="http://schemas.openxmlformats.org/officeDocument/2006/math" xmlns:mc="http://schemas.openxmlformats.org/markup-compatibility/2006" xmlns:mo="http://schemas.microsoft.com/office/mac/office/2008/main" xmlns:mv="urn:schemas-microsoft-com:mac:vml" xmlns:o="urn:schemas-microsoft-com:office:office" xmlns:r="http://schemas.openxmlformats.org/officeDocument/2006/relationships" xmlns:v="urn:schemas-microsoft-com:vml" xmlns:w10="urn:schemas-microsoft-com:office:word" xmlns:w14="http://schemas.microsoft.com/office/word/2010/wordml" xmlns:w="http://schemas.openxmlformats.org/wordprocessingml/2006/main" xmlns:wne="http://schemas.microsoft.com/office/word/2006/wordml" xmlns:wp14="http://schemas.microsoft.com/office/word/2010/wordprocessingDrawing" xmlns:wp="http://schemas.openxmlformats.org/drawingml/2006/wordprocessingDrawing" xmlns:wpc="http://schemas.microsoft.com/office/word/2010/wordprocessingCanvas" xmlns:wpg="http://schemas.microsoft.com/office/word/2010/wordprocessingGroup" xmlns:wpi="http://schemas.microsoft.com/office/word/2010/wordprocessingInk" xmlns:wps="http://schemas.microsoft.com/office/word/2010/wordprocessingShape" mc:Ignorable="w14 wp14">
+  <w:p>
+    <w:pPr>
+      <w:pStyle w:val="Footer"/>
+    </w:pPr>
+  </w:p>
+</w:ftr>
+</file>
+
+<file path=word/footer5.xml><?xml version="1.0" encoding="utf-8"?>
+<w:ftr xmlns:m="http://schemas.openxmlformats.org/officeDocument/2006/math" xmlns:mc="http://schemas.openxmlformats.org/markup-compatibility/2006" xmlns:mo="http://schemas.microsoft.com/office/mac/office/2008/main" xmlns:mv="urn:schemas-microsoft-com:mac:vml" xmlns:o="urn:schemas-microsoft-com:office:office" xmlns:r="http://schemas.openxmlformats.org/officeDocument/2006/relationships" xmlns:v="urn:schemas-microsoft-com:vml" xmlns:w10="urn:schemas-microsoft-com:office:word" xmlns:w14="http://schemas.microsoft.com/office/word/2010/wordml" xmlns:w="http://schemas.openxmlformats.org/wordprocessingml/2006/main" xmlns:wne="http://schemas.microsoft.com/office/word/2006/wordml" xmlns:wp14="http://schemas.microsoft.com/office/word/2010/wordprocessingDrawing" xmlns:wp="http://schemas.openxmlformats.org/drawingml/2006/wordprocessingDrawing" xmlns:wpc="http://schemas.microsoft.com/office/word/2010/wordprocessingCanvas" xmlns:wpg="http://schemas.microsoft.com/office/word/2010/wordprocessingGroup" xmlns:wpi="http://schemas.microsoft.com/office/word/2010/wordprocessingInk" xmlns:wps="http://schemas.microsoft.com/office/word/2010/wordprocessingShape" mc:Ignorable="w14 wp14">
   <w:p>
     <w:pPr>
       <w:pStyle w:val="Footer"/>
@@ -4549,45 +4107,20 @@
       <w:pStyle w:val="CLALTRHeaderorFooter"/>
     </w:pPr>
     <w:r>
-      <w:fldChar w:fldCharType="begin"/>
-    </w:r>
-    <w:r>
-      <w:instrText xml:space="preserve">MACROBUTTON NoMacro [Click </w:instrText>
-    </w:r>
-    <w:r>
-      <w:rPr>
-        <w:b/>
-      </w:rPr>
-      <w:instrText>here</w:instrText>
-    </w:r>
-    <w:r>
-      <w:instrText xml:space="preserve"> and type date]</w:instrText>
-    </w:r>
-    <w:r>
-      <w:fldChar w:fldCharType="end"/>
+      <w:t>September 29, 2026</w:t>
     </w:r>
   </w:p>
   <w:p>
     <w:pPr>
       <w:pStyle w:val="CLALTRHeaderorFooter"/>
     </w:pPr>
+    <w:proofErr w:type="spellStart"/>
     <w:r>
-      <w:fldChar w:fldCharType="begin"/>
+      <w:t>Swysh</w:t>
     </w:r>
+    <w:proofErr w:type="spellEnd"/>
     <w:r>
-      <w:instrText xml:space="preserve">MACROBUTTON NoMacro [Click </w:instrText>
-    </w:r>
-    <w:r>
-      <w:rPr>
-        <w:b/>
-      </w:rPr>
-      <w:instrText>here</w:instrText>
-    </w:r>
-    <w:r>
-      <w:instrText xml:space="preserve"> and type organization]</w:instrText>
-    </w:r>
-    <w:r>
-      <w:fldChar w:fldCharType="end"/>
+      <w:t xml:space="preserve"> Den Basketball Inc.</w:t>
     </w:r>
   </w:p>
   <w:p>
@@ -4621,6 +4154,16 @@
 
 <file path=word/header4.xml><?xml version="1.0" encoding="utf-8"?>
 <w:hdr xmlns:wpc="http://schemas.microsoft.com/office/word/2010/wordprocessingCanvas" xmlns:cx="http://schemas.microsoft.com/office/drawing/2014/chartex" xmlns:cx1="http://schemas.microsoft.com/office/drawing/2015/9/8/chartex" xmlns:cx2="http://schemas.microsoft.com/office/drawing/2015/10/21/chartex" xmlns:cx3="http://schemas.microsoft.com/office/drawing/2016/5/9/chartex" xmlns:cx4="http://schemas.microsoft.com/office/drawing/2016/5/10/chartex" xmlns:cx5="http://schemas.microsoft.com/office/drawing/2016/5/11/chartex" xmlns:cx6="http://schemas.microsoft.com/office/drawing/2016/5/12/chartex" xmlns:cx7="http://schemas.microsoft.com/office/drawing/2016/5/13/chartex" xmlns:cx8="http://schemas.microsoft.com/office/drawing/2016/5/14/chartex" xmlns:mc="http://schemas.openxmlformats.org/markup-compatibility/2006" xmlns:aink="http://schemas.microsoft.com/office/drawing/2016/ink" xmlns:am3d="http://schemas.microsoft.com/office/drawing/2017/model3d" xmlns:o="urn:schemas-microsoft-com:office:office" xmlns:oel="http://schemas.microsoft.com/office/2019/extlst" xmlns:r="http://schemas.openxmlformats.org/officeDocument/2006/relationships" xmlns:m="http://schemas.openxmlformats.org/officeDocument/2006/math" xmlns:v="urn:schemas-microsoft-com:vml" xmlns:wp14="http://schemas.microsoft.com/office/word/2010/wordprocessingDrawing" xmlns:wp="http://schemas.openxmlformats.org/drawingml/2006/wordprocessingDrawing" xmlns:w10="urn:schemas-microsoft-com:office:word" xmlns:w="http://schemas.openxmlformats.org/wordprocessingml/2006/main" xmlns:w14="http://schemas.microsoft.com/office/word/2010/wordml" xmlns:w15="http://schemas.microsoft.com/office/word/2012/wordml" xmlns:w16cex="http://schemas.microsoft.com/office/word/2018/wordml/cex" xmlns:w16cid="http://schemas.microsoft.com/office/word/2016/wordml/cid" xmlns:w16="http://schemas.microsoft.com/office/word/2018/wordml" xmlns:w16du="http://schemas.microsoft.com/office/word/2023/wordml/word16du" xmlns:w16sdtdh="http://schemas.microsoft.com/office/word/2020/wordml/sdtdatahash" xmlns:w16sdtfl="http://schemas.microsoft.com/office/word/2024/wordml/sdtformatlock" xmlns:w16se="http://schemas.microsoft.com/office/word/2015/wordml/symex" xmlns:wpg="http://schemas.microsoft.com/office/word/2010/wordprocessingGroup" xmlns:wpi="http://schemas.microsoft.com/office/word/2010/wordprocessingInk" xmlns:wne="http://schemas.microsoft.com/office/word/2006/wordml" xmlns:wps="http://schemas.microsoft.com/office/word/2010/wordprocessingShape" mc:Ignorable="w14 w15 w16se w16cid w16 w16cex w16sdtdh w16sdtfl w16du wp14">
+  <w:p>
+    <w:pPr>
+      <w:pStyle w:val="Header"/>
+    </w:pPr>
+  </w:p>
+</w:hdr>
+</file>
+
+<file path=word/header5.xml><?xml version="1.0" encoding="utf-8"?>
+<w:hdr xmlns:m="http://schemas.openxmlformats.org/officeDocument/2006/math" xmlns:mc="http://schemas.openxmlformats.org/markup-compatibility/2006" xmlns:mo="http://schemas.microsoft.com/office/mac/office/2008/main" xmlns:mv="urn:schemas-microsoft-com:mac:vml" xmlns:o="urn:schemas-microsoft-com:office:office" xmlns:r="http://schemas.openxmlformats.org/officeDocument/2006/relationships" xmlns:v="urn:schemas-microsoft-com:vml" xmlns:w10="urn:schemas-microsoft-com:office:word" xmlns:w14="http://schemas.microsoft.com/office/word/2010/wordml" xmlns:w="http://schemas.openxmlformats.org/wordprocessingml/2006/main" xmlns:wne="http://schemas.microsoft.com/office/word/2006/wordml" xmlns:wp14="http://schemas.microsoft.com/office/word/2010/wordprocessingDrawing" xmlns:wp="http://schemas.openxmlformats.org/drawingml/2006/wordprocessingDrawing" xmlns:wpc="http://schemas.microsoft.com/office/word/2010/wordprocessingCanvas" xmlns:wpg="http://schemas.microsoft.com/office/word/2010/wordprocessingGroup" xmlns:wpi="http://schemas.microsoft.com/office/word/2010/wordprocessingInk" xmlns:wps="http://schemas.microsoft.com/office/word/2010/wordprocessingShape" mc:Ignorable="w14 wp14">
   <w:p>
     <w:pPr>
       <w:pStyle w:val="Header"/>

</xml_diff>